<commit_message>
Finish AI template folder (AI - 02, 03, 05)
</commit_message>
<xml_diff>
--- a/AI_Templates/[AI-03] - FIT@HCMUS - AI Disclosure Form_En.docx
+++ b/AI_Templates/[AI-03] - FIT@HCMUS - AI Disclosure Form_En.docx
@@ -225,7 +225,20 @@
           <w:p>
             <w:pPr>
               <w:cnfStyle w:val="000000010000" w:firstRow="0" w:lastRow="0" w:firstColumn="0" w:lastColumn="0" w:oddVBand="0" w:evenVBand="0" w:oddHBand="0" w:evenHBand="1" w:firstRowFirstColumn="0" w:firstRowLastColumn="0" w:lastRowFirstColumn="0" w:lastRowLastColumn="0"/>
+              <w:rPr>
+                <w:rFonts w:ascii="Arial" w:hAnsi="Arial" w:cs="Arial"/>
+                <w:sz w:val="21"/>
+                <w:szCs w:val="21"/>
+              </w:rPr>
             </w:pPr>
+            <w:r>
+              <w:rPr>
+                <w:rFonts w:ascii="Arial" w:hAnsi="Arial" w:cs="Arial"/>
+                <w:sz w:val="21"/>
+                <w:szCs w:val="21"/>
+              </w:rPr>
+              <w:t>HW#01</w:t>
+            </w:r>
           </w:p>
         </w:tc>
       </w:tr>
@@ -255,7 +268,20 @@
           <w:p>
             <w:pPr>
               <w:cnfStyle w:val="000000100000" w:firstRow="0" w:lastRow="0" w:firstColumn="0" w:lastColumn="0" w:oddVBand="0" w:evenVBand="0" w:oddHBand="1" w:evenHBand="0" w:firstRowFirstColumn="0" w:firstRowLastColumn="0" w:lastRowFirstColumn="0" w:lastRowLastColumn="0"/>
+              <w:rPr>
+                <w:rFonts w:ascii="Arial" w:hAnsi="Arial" w:cs="Arial"/>
+                <w:sz w:val="21"/>
+                <w:szCs w:val="21"/>
+              </w:rPr>
             </w:pPr>
+            <w:r>
+              <w:rPr>
+                <w:rFonts w:ascii="Arial" w:hAnsi="Arial" w:cs="Arial"/>
+                <w:sz w:val="21"/>
+                <w:szCs w:val="21"/>
+              </w:rPr>
+              <w:t>Software Testing HW01 – QA/QC Job Research, Software Defect Analysis, and Physical Product Test Cases</w:t>
+            </w:r>
           </w:p>
         </w:tc>
       </w:tr>
@@ -291,7 +317,14 @@
                 <w:rFonts w:ascii="Arial" w:hAnsi="Arial"/>
                 <w:sz w:val="21"/>
               </w:rPr>
-              <w:t>Category ____</w:t>
+              <w:t xml:space="preserve">Category </w:t>
+            </w:r>
+            <w:r>
+              <w:rPr>
+                <w:rFonts w:ascii="Arial" w:hAnsi="Arial"/>
+                <w:sz w:val="21"/>
+              </w:rPr>
+              <w:t>3</w:t>
             </w:r>
           </w:p>
         </w:tc>
@@ -322,7 +355,36 @@
           <w:p>
             <w:pPr>
               <w:cnfStyle w:val="000000100000" w:firstRow="0" w:lastRow="0" w:firstColumn="0" w:lastColumn="0" w:oddVBand="0" w:evenVBand="0" w:oddHBand="1" w:evenHBand="0" w:firstRowFirstColumn="0" w:firstRowLastColumn="0" w:lastRowFirstColumn="0" w:lastRowLastColumn="0"/>
+              <w:rPr>
+                <w:rFonts w:ascii="Arial" w:hAnsi="Arial" w:cs="Arial"/>
+                <w:sz w:val="21"/>
+                <w:szCs w:val="21"/>
+              </w:rPr>
             </w:pPr>
+            <w:r>
+              <w:rPr>
+                <w:rFonts w:ascii="Arial" w:hAnsi="Arial" w:cs="Arial"/>
+                <w:sz w:val="21"/>
+                <w:szCs w:val="21"/>
+              </w:rPr>
+              <w:t>0</w:t>
+            </w:r>
+            <w:r>
+              <w:rPr>
+                <w:rFonts w:ascii="Arial" w:hAnsi="Arial" w:cs="Arial"/>
+                <w:sz w:val="21"/>
+                <w:szCs w:val="21"/>
+              </w:rPr>
+              <w:t>8</w:t>
+            </w:r>
+            <w:r>
+              <w:rPr>
+                <w:rFonts w:ascii="Arial" w:hAnsi="Arial" w:cs="Arial"/>
+                <w:sz w:val="21"/>
+                <w:szCs w:val="21"/>
+              </w:rPr>
+              <w:t>/06/2026</w:t>
+            </w:r>
           </w:p>
         </w:tc>
       </w:tr>
@@ -352,7 +414,20 @@
           <w:p>
             <w:pPr>
               <w:cnfStyle w:val="000000010000" w:firstRow="0" w:lastRow="0" w:firstColumn="0" w:lastColumn="0" w:oddVBand="0" w:evenVBand="0" w:oddHBand="0" w:evenHBand="1" w:firstRowFirstColumn="0" w:firstRowLastColumn="0" w:lastRowFirstColumn="0" w:lastRowLastColumn="0"/>
+              <w:rPr>
+                <w:rFonts w:ascii="Arial" w:hAnsi="Arial" w:cs="Arial"/>
+                <w:sz w:val="21"/>
+                <w:szCs w:val="21"/>
+              </w:rPr>
             </w:pPr>
+            <w:r>
+              <w:rPr>
+                <w:rFonts w:ascii="Arial" w:hAnsi="Arial" w:cs="Arial"/>
+                <w:sz w:val="21"/>
+                <w:szCs w:val="21"/>
+              </w:rPr>
+              <w:t>ÂN TIẾN NGUYÊN AN</w:t>
+            </w:r>
           </w:p>
         </w:tc>
       </w:tr>
@@ -382,7 +457,20 @@
           <w:p>
             <w:pPr>
               <w:cnfStyle w:val="000000100000" w:firstRow="0" w:lastRow="0" w:firstColumn="0" w:lastColumn="0" w:oddVBand="0" w:evenVBand="0" w:oddHBand="1" w:evenHBand="0" w:firstRowFirstColumn="0" w:firstRowLastColumn="0" w:lastRowFirstColumn="0" w:lastRowLastColumn="0"/>
+              <w:rPr>
+                <w:rFonts w:ascii="Arial" w:hAnsi="Arial" w:cs="Arial"/>
+                <w:sz w:val="21"/>
+                <w:szCs w:val="21"/>
+              </w:rPr>
             </w:pPr>
+            <w:r>
+              <w:rPr>
+                <w:rFonts w:ascii="Arial" w:hAnsi="Arial" w:cs="Arial"/>
+                <w:sz w:val="21"/>
+                <w:szCs w:val="21"/>
+              </w:rPr>
+              <w:t>23127148</w:t>
+            </w:r>
           </w:p>
         </w:tc>
       </w:tr>
@@ -421,27 +509,41 @@
       </w:r>
     </w:p>
     <w:p>
-      <w:r>
-        <w:rPr>
-          <w:rFonts w:ascii="Arial" w:hAnsi="Arial"/>
-        </w:rPr>
-        <w:t>__________________________________________________________________________________________</w:t>
-      </w:r>
-    </w:p>
-    <w:p>
-      <w:r>
-        <w:rPr>
-          <w:rFonts w:ascii="Arial" w:hAnsi="Arial"/>
-        </w:rPr>
-        <w:t>__________________________________________________________________________________________</w:t>
-      </w:r>
-    </w:p>
-    <w:p>
-      <w:r>
-        <w:rPr>
-          <w:rFonts w:ascii="Arial" w:hAnsi="Arial"/>
-        </w:rPr>
-        <w:t>__________________________________________________________________________________________</w:t>
+      <w:pPr>
+        <w:rPr>
+          <w:rFonts w:ascii="Arial" w:hAnsi="Arial"/>
+        </w:rPr>
+      </w:pPr>
+      <w:r>
+        <w:rPr>
+          <w:rFonts w:ascii="Arial" w:hAnsi="Arial"/>
+        </w:rPr>
+        <w:t xml:space="preserve">- </w:t>
+      </w:r>
+      <w:r>
+        <w:rPr>
+          <w:rFonts w:ascii="Arial" w:hAnsi="Arial"/>
+        </w:rPr>
+        <w:t>GPT-5.5 (OpenAI) through Cursor IDE</w:t>
+      </w:r>
+    </w:p>
+    <w:p>
+      <w:pPr>
+        <w:rPr>
+          <w:rFonts w:ascii="Arial" w:hAnsi="Arial"/>
+        </w:rPr>
+      </w:pPr>
+      <w:r>
+        <w:rPr>
+          <w:rFonts w:ascii="Arial" w:hAnsi="Arial"/>
+        </w:rPr>
+        <w:t>-</w:t>
+      </w:r>
+      <w:r>
+        <w:rPr>
+          <w:rFonts w:ascii="Arial" w:hAnsi="Arial"/>
+        </w:rPr>
+        <w:t xml:space="preserve"> Perplexity AI Assistant.</w:t>
       </w:r>
     </w:p>
     <w:p>
@@ -467,28 +569,16 @@
       </w:r>
     </w:p>
     <w:p>
-      <w:r>
-        <w:rPr>
-          <w:rFonts w:ascii="Arial" w:hAnsi="Arial"/>
-        </w:rPr>
-        <w:t>__________________________________________________________________________________________</w:t>
-      </w:r>
-    </w:p>
-    <w:p>
-      <w:r>
-        <w:rPr>
-          <w:rFonts w:ascii="Arial" w:hAnsi="Arial"/>
-        </w:rPr>
-        <w:t>__________________________________________________________________________________________</w:t>
-      </w:r>
-    </w:p>
-    <w:p>
-      <w:r>
-        <w:rPr>
-          <w:rFonts w:ascii="Arial" w:hAnsi="Arial"/>
-        </w:rPr>
-        <w:lastRenderedPageBreak/>
-        <w:t>__________________________________________________________________________________________</w:t>
+      <w:pPr>
+        <w:rPr>
+          <w:rFonts w:ascii="Arial" w:hAnsi="Arial" w:cs="Arial"/>
+        </w:rPr>
+      </w:pPr>
+      <w:r>
+        <w:rPr>
+          <w:rFonts w:ascii="Arial" w:hAnsi="Arial" w:cs="Arial"/>
+        </w:rPr>
+        <w:t>[x] brainstorming  [x] outlining  [x] drafting  [x] feedback  [x] revision  [ ] coding  [ ] data analysis  [ ] visual design  [x] other: Excel artifact structuring and AI-output audit support</w:t>
       </w:r>
     </w:p>
     <w:p>
@@ -503,60 +593,14 @@
       </w:r>
     </w:p>
     <w:p>
-      <w:r>
+      <w:pPr>
         <w:rPr>
           <w:rFonts w:ascii="Arial" w:hAnsi="Arial"/>
           <w:i/>
           <w:color w:val="707070"/>
           <w:sz w:val="20"/>
         </w:rPr>
-        <w:t>Paste the 2–3 most impactful prompts verbatim. For the full transcript, attach Appendix A (prompt_log.md).</w:t>
-      </w:r>
-    </w:p>
-    <w:p>
-      <w:r>
-        <w:rPr>
-          <w:rFonts w:ascii="Arial" w:hAnsi="Arial"/>
-        </w:rPr>
-        <w:t>__________________________________________________________________________________________</w:t>
-      </w:r>
-    </w:p>
-    <w:p>
-      <w:r>
-        <w:rPr>
-          <w:rFonts w:ascii="Arial" w:hAnsi="Arial"/>
-        </w:rPr>
-        <w:t>__________________________________________________________________________________________</w:t>
-      </w:r>
-    </w:p>
-    <w:p>
-      <w:r>
-        <w:rPr>
-          <w:rFonts w:ascii="Arial" w:hAnsi="Arial"/>
-        </w:rPr>
-        <w:t>__________________________________________________________________________________________</w:t>
-      </w:r>
-    </w:p>
-    <w:p>
-      <w:r>
-        <w:rPr>
-          <w:rFonts w:ascii="Arial" w:hAnsi="Arial"/>
-        </w:rPr>
-        <w:t>__________________________________________________________________________________________</w:t>
-      </w:r>
-    </w:p>
-    <w:p>
-      <w:pPr>
-        <w:pStyle w:val="Heading3"/>
-      </w:pPr>
-      <w:r>
-        <w:rPr>
-          <w:rFonts w:ascii="Arial" w:hAnsi="Arial"/>
-        </w:rPr>
-        <w:t>4. Specific parts of the work AI contributed to:</w:t>
-      </w:r>
-    </w:p>
-    <w:p>
+      </w:pPr>
       <w:r>
         <w:rPr>
           <w:rFonts w:ascii="Arial" w:hAnsi="Arial"/>
@@ -564,39 +608,2604 @@
           <w:color w:val="707070"/>
           <w:sz w:val="20"/>
         </w:rPr>
-        <w:t>Be specific. Example: 'AI generated TC01–TC15 in Section 3.2; I rewrote TC04 and TC11; AI did NOT contribute to Sections 1, 2, 4, or the AI Critique.'</w:t>
-      </w:r>
-    </w:p>
-    <w:p>
-      <w:r>
-        <w:rPr>
-          <w:rFonts w:ascii="Arial" w:hAnsi="Arial"/>
-        </w:rPr>
-        <w:t>__________________________________________________________________________________________</w:t>
-      </w:r>
-    </w:p>
-    <w:p>
-      <w:r>
-        <w:rPr>
-          <w:rFonts w:ascii="Arial" w:hAnsi="Arial"/>
-        </w:rPr>
-        <w:t>__________________________________________________________________________________________</w:t>
-      </w:r>
-    </w:p>
-    <w:p>
-      <w:r>
-        <w:rPr>
-          <w:rFonts w:ascii="Arial" w:hAnsi="Arial"/>
-        </w:rPr>
-        <w:t>__________________________________________________________________________________________</w:t>
-      </w:r>
-    </w:p>
-    <w:p>
-      <w:r>
-        <w:rPr>
-          <w:rFonts w:ascii="Arial" w:hAnsi="Arial"/>
-        </w:rPr>
-        <w:t>__________________________________________________________________________________________</w:t>
+        <w:t>Paste the 2–3 most impactful prompts verbatim. For the full transcript, attach Appendix A (prompt_log.md).</w:t>
+      </w:r>
+    </w:p>
+    <w:p>
+      <w:pPr>
+        <w:rPr>
+          <w:rFonts w:ascii="Arial" w:hAnsi="Arial"/>
+          <w:b/>
+          <w:bCs/>
+          <w:iCs/>
+          <w:sz w:val="20"/>
+        </w:rPr>
+      </w:pPr>
+      <w:r>
+        <w:rPr>
+          <w:rFonts w:ascii="Arial" w:hAnsi="Arial"/>
+          <w:b/>
+          <w:bCs/>
+          <w:iCs/>
+          <w:sz w:val="20"/>
+        </w:rPr>
+        <w:t>PROMPT 1 - Requirement 1 AI Impact Analysis</w:t>
+      </w:r>
+    </w:p>
+    <w:p>
+      <w:pPr>
+        <w:rPr>
+          <w:rFonts w:ascii="Arial" w:hAnsi="Arial"/>
+          <w:iCs/>
+          <w:sz w:val="20"/>
+        </w:rPr>
+      </w:pPr>
+      <w:r>
+        <w:rPr>
+          <w:rFonts w:ascii="Arial" w:hAnsi="Arial"/>
+          <w:iCs/>
+          <w:sz w:val="20"/>
+        </w:rPr>
+        <w:t>You are a software testing instructor and QA/QC career analyst helping me complete Requirement 1 of my Software Testing HW01 report.</w:t>
+      </w:r>
+    </w:p>
+    <w:p>
+      <w:pPr>
+        <w:rPr>
+          <w:rFonts w:ascii="Arial" w:hAnsi="Arial"/>
+          <w:iCs/>
+          <w:sz w:val="20"/>
+        </w:rPr>
+      </w:pPr>
+    </w:p>
+    <w:p>
+      <w:pPr>
+        <w:rPr>
+          <w:rFonts w:ascii="Arial" w:hAnsi="Arial"/>
+          <w:iCs/>
+          <w:sz w:val="20"/>
+        </w:rPr>
+      </w:pPr>
+      <w:r>
+        <w:rPr>
+          <w:rFonts w:ascii="Arial" w:hAnsi="Arial"/>
+          <w:iCs/>
+          <w:sz w:val="20"/>
+        </w:rPr>
+        <w:t>Context files:</w:t>
+      </w:r>
+    </w:p>
+    <w:p>
+      <w:pPr>
+        <w:rPr>
+          <w:rFonts w:ascii="Arial" w:hAnsi="Arial"/>
+          <w:iCs/>
+          <w:sz w:val="20"/>
+        </w:rPr>
+      </w:pPr>
+      <w:r>
+        <w:rPr>
+          <w:rFonts w:ascii="Arial" w:hAnsi="Arial"/>
+          <w:iCs/>
+          <w:sz w:val="20"/>
+        </w:rPr>
+        <w:t>- HW01.md contains the assignment requirements and AI audit rules.</w:t>
+      </w:r>
+    </w:p>
+    <w:p>
+      <w:pPr>
+        <w:rPr>
+          <w:rFonts w:ascii="Arial" w:hAnsi="Arial"/>
+          <w:iCs/>
+          <w:sz w:val="20"/>
+        </w:rPr>
+      </w:pPr>
+      <w:r>
+        <w:rPr>
+          <w:rFonts w:ascii="Arial" w:hAnsi="Arial"/>
+          <w:iCs/>
+          <w:sz w:val="20"/>
+        </w:rPr>
+        <w:t>- Report/requirement_1.md contains my completed Requirement 1 job-posting research.</w:t>
+      </w:r>
+    </w:p>
+    <w:p>
+      <w:pPr>
+        <w:rPr>
+          <w:rFonts w:ascii="Arial" w:hAnsi="Arial"/>
+          <w:iCs/>
+          <w:sz w:val="20"/>
+        </w:rPr>
+      </w:pPr>
+      <w:r>
+        <w:rPr>
+          <w:rFonts w:ascii="Arial" w:hAnsi="Arial"/>
+          <w:iCs/>
+          <w:sz w:val="20"/>
+        </w:rPr>
+        <w:t>- Requirement 1 asks for 10 QA/QC job postings, and each posting must include 1–2 sentences of AI Impact Analysis.</w:t>
+      </w:r>
+    </w:p>
+    <w:p>
+      <w:pPr>
+        <w:rPr>
+          <w:rFonts w:ascii="Arial" w:hAnsi="Arial"/>
+          <w:iCs/>
+          <w:sz w:val="20"/>
+        </w:rPr>
+      </w:pPr>
+      <w:r>
+        <w:rPr>
+          <w:rFonts w:ascii="Arial" w:hAnsi="Arial"/>
+          <w:iCs/>
+          <w:sz w:val="20"/>
+        </w:rPr>
+        <w:t>- I already collected the job links, dated screenshot evidence, job descriptions, required skills, salary information, and whether each job requires AI/LLM/automation-AI skills.</w:t>
+      </w:r>
+    </w:p>
+    <w:p>
+      <w:pPr>
+        <w:rPr>
+          <w:rFonts w:ascii="Arial" w:hAnsi="Arial"/>
+          <w:iCs/>
+          <w:sz w:val="20"/>
+        </w:rPr>
+      </w:pPr>
+      <w:r>
+        <w:rPr>
+          <w:rFonts w:ascii="Arial" w:hAnsi="Arial"/>
+          <w:iCs/>
+          <w:sz w:val="20"/>
+        </w:rPr>
+        <w:t>- The missing part is the “Phân tích tác động của AI” section for all 10 jobs.</w:t>
+      </w:r>
+    </w:p>
+    <w:p>
+      <w:pPr>
+        <w:rPr>
+          <w:rFonts w:ascii="Arial" w:hAnsi="Arial"/>
+          <w:iCs/>
+          <w:sz w:val="20"/>
+        </w:rPr>
+      </w:pPr>
+    </w:p>
+    <w:p>
+      <w:pPr>
+        <w:rPr>
+          <w:rFonts w:ascii="Arial" w:hAnsi="Arial"/>
+          <w:iCs/>
+          <w:sz w:val="20"/>
+        </w:rPr>
+      </w:pPr>
+      <w:r>
+        <w:rPr>
+          <w:rFonts w:ascii="Arial" w:hAnsi="Arial"/>
+          <w:iCs/>
+          <w:sz w:val="20"/>
+        </w:rPr>
+        <w:t>Task:</w:t>
+      </w:r>
+    </w:p>
+    <w:p>
+      <w:pPr>
+        <w:rPr>
+          <w:rFonts w:ascii="Arial" w:hAnsi="Arial"/>
+          <w:iCs/>
+          <w:sz w:val="20"/>
+        </w:rPr>
+      </w:pPr>
+      <w:r>
+        <w:rPr>
+          <w:rFonts w:ascii="Arial" w:hAnsi="Arial"/>
+          <w:iCs/>
+          <w:sz w:val="20"/>
+        </w:rPr>
+        <w:t>Read HW01.md first to understand the grading requirements.</w:t>
+      </w:r>
+    </w:p>
+    <w:p>
+      <w:pPr>
+        <w:rPr>
+          <w:rFonts w:ascii="Arial" w:hAnsi="Arial"/>
+          <w:iCs/>
+          <w:sz w:val="20"/>
+        </w:rPr>
+      </w:pPr>
+      <w:r>
+        <w:rPr>
+          <w:rFonts w:ascii="Arial" w:hAnsi="Arial"/>
+          <w:iCs/>
+          <w:sz w:val="20"/>
+        </w:rPr>
+        <w:t>Then read Report/requirement_1.md and replace every “TODO” under “#### Phân tích tác động của AI” with a suitable AI Impact Analysis for that specific job.</w:t>
+      </w:r>
+    </w:p>
+    <w:p>
+      <w:pPr>
+        <w:rPr>
+          <w:rFonts w:ascii="Arial" w:hAnsi="Arial"/>
+          <w:iCs/>
+          <w:sz w:val="20"/>
+        </w:rPr>
+      </w:pPr>
+    </w:p>
+    <w:p>
+      <w:pPr>
+        <w:rPr>
+          <w:rFonts w:ascii="Arial" w:hAnsi="Arial"/>
+          <w:iCs/>
+          <w:sz w:val="20"/>
+        </w:rPr>
+      </w:pPr>
+      <w:r>
+        <w:rPr>
+          <w:rFonts w:ascii="Arial" w:hAnsi="Arial"/>
+          <w:iCs/>
+          <w:sz w:val="20"/>
+        </w:rPr>
+        <w:t>Output requirements:</w:t>
+      </w:r>
+    </w:p>
+    <w:p>
+      <w:pPr>
+        <w:rPr>
+          <w:rFonts w:ascii="Arial" w:hAnsi="Arial"/>
+          <w:iCs/>
+          <w:sz w:val="20"/>
+        </w:rPr>
+      </w:pPr>
+      <w:r>
+        <w:rPr>
+          <w:rFonts w:ascii="Arial" w:hAnsi="Arial"/>
+          <w:iCs/>
+          <w:sz w:val="20"/>
+        </w:rPr>
+        <w:t>- Write in Vietnamese.</w:t>
+      </w:r>
+    </w:p>
+    <w:p>
+      <w:pPr>
+        <w:rPr>
+          <w:rFonts w:ascii="Arial" w:hAnsi="Arial"/>
+          <w:iCs/>
+          <w:sz w:val="20"/>
+        </w:rPr>
+      </w:pPr>
+      <w:r>
+        <w:rPr>
+          <w:rFonts w:ascii="Arial" w:hAnsi="Arial"/>
+          <w:iCs/>
+          <w:sz w:val="20"/>
+        </w:rPr>
+        <w:t>- Each AI Impact Analysis must be 1–2 sentences only.</w:t>
+      </w:r>
+    </w:p>
+    <w:p>
+      <w:pPr>
+        <w:rPr>
+          <w:rFonts w:ascii="Arial" w:hAnsi="Arial"/>
+          <w:iCs/>
+          <w:sz w:val="20"/>
+        </w:rPr>
+      </w:pPr>
+      <w:r>
+        <w:rPr>
+          <w:rFonts w:ascii="Arial" w:hAnsi="Arial"/>
+          <w:iCs/>
+          <w:sz w:val="20"/>
+        </w:rPr>
+        <w:t>- Match the tone and style of the existing Requirement 1 report.</w:t>
+      </w:r>
+    </w:p>
+    <w:p>
+      <w:pPr>
+        <w:rPr>
+          <w:rFonts w:ascii="Arial" w:hAnsi="Arial"/>
+          <w:iCs/>
+          <w:sz w:val="20"/>
+        </w:rPr>
+      </w:pPr>
+      <w:r>
+        <w:rPr>
+          <w:rFonts w:ascii="Arial" w:hAnsi="Arial"/>
+          <w:iCs/>
+          <w:sz w:val="20"/>
+        </w:rPr>
+        <w:t>- Keep the analysis specific to each job.</w:t>
+      </w:r>
+    </w:p>
+    <w:p>
+      <w:pPr>
+        <w:rPr>
+          <w:rFonts w:ascii="Arial" w:hAnsi="Arial"/>
+          <w:iCs/>
+          <w:sz w:val="20"/>
+        </w:rPr>
+      </w:pPr>
+      <w:r>
+        <w:rPr>
+          <w:rFonts w:ascii="Arial" w:hAnsi="Arial"/>
+          <w:iCs/>
+          <w:sz w:val="20"/>
+        </w:rPr>
+        <w:t>- Do not repeat the same generic wording across all jobs.</w:t>
+      </w:r>
+    </w:p>
+    <w:p>
+      <w:pPr>
+        <w:rPr>
+          <w:rFonts w:ascii="Arial" w:hAnsi="Arial"/>
+          <w:iCs/>
+          <w:sz w:val="20"/>
+        </w:rPr>
+      </w:pPr>
+      <w:r>
+        <w:rPr>
+          <w:rFonts w:ascii="Arial" w:hAnsi="Arial"/>
+          <w:iCs/>
+          <w:sz w:val="20"/>
+        </w:rPr>
+        <w:t>- Do not invent new job data, salary, companies, links, screenshots, dates, or requirements.</w:t>
+      </w:r>
+    </w:p>
+    <w:p>
+      <w:pPr>
+        <w:rPr>
+          <w:rFonts w:ascii="Arial" w:hAnsi="Arial"/>
+          <w:iCs/>
+          <w:sz w:val="20"/>
+        </w:rPr>
+      </w:pPr>
+      <w:r>
+        <w:rPr>
+          <w:rFonts w:ascii="Arial" w:hAnsi="Arial"/>
+          <w:iCs/>
+          <w:sz w:val="20"/>
+        </w:rPr>
+        <w:t>- Base the analysis only on the existing job description and required skills in Report/requirement_1.md.</w:t>
+      </w:r>
+    </w:p>
+    <w:p>
+      <w:pPr>
+        <w:rPr>
+          <w:rFonts w:ascii="Arial" w:hAnsi="Arial"/>
+          <w:iCs/>
+          <w:sz w:val="20"/>
+        </w:rPr>
+      </w:pPr>
+      <w:r>
+        <w:rPr>
+          <w:rFonts w:ascii="Arial" w:hAnsi="Arial"/>
+          <w:iCs/>
+          <w:sz w:val="20"/>
+        </w:rPr>
+        <w:t>- Preserve the current Markdown structure.</w:t>
+      </w:r>
+    </w:p>
+    <w:p>
+      <w:pPr>
+        <w:rPr>
+          <w:rFonts w:ascii="Arial" w:hAnsi="Arial"/>
+          <w:iCs/>
+          <w:sz w:val="20"/>
+        </w:rPr>
+      </w:pPr>
+      <w:r>
+        <w:rPr>
+          <w:rFonts w:ascii="Arial" w:hAnsi="Arial"/>
+          <w:iCs/>
+          <w:sz w:val="20"/>
+        </w:rPr>
+        <w:t>- Do not edit any section except the “TODO” lines under “#### Phân tích tác động của AI”.</w:t>
+      </w:r>
+    </w:p>
+    <w:p>
+      <w:pPr>
+        <w:rPr>
+          <w:rFonts w:ascii="Arial" w:hAnsi="Arial"/>
+          <w:iCs/>
+          <w:sz w:val="20"/>
+        </w:rPr>
+      </w:pPr>
+      <w:r>
+        <w:rPr>
+          <w:rFonts w:ascii="Arial" w:hAnsi="Arial"/>
+          <w:iCs/>
+          <w:sz w:val="20"/>
+        </w:rPr>
+        <w:t>- Do not create new files.</w:t>
+      </w:r>
+    </w:p>
+    <w:p>
+      <w:pPr>
+        <w:rPr>
+          <w:rFonts w:ascii="Arial" w:hAnsi="Arial"/>
+          <w:iCs/>
+          <w:sz w:val="20"/>
+        </w:rPr>
+      </w:pPr>
+    </w:p>
+    <w:p>
+      <w:pPr>
+        <w:rPr>
+          <w:rFonts w:ascii="Arial" w:hAnsi="Arial"/>
+          <w:iCs/>
+          <w:sz w:val="20"/>
+        </w:rPr>
+      </w:pPr>
+      <w:r>
+        <w:rPr>
+          <w:rFonts w:ascii="Arial" w:hAnsi="Arial"/>
+          <w:iCs/>
+          <w:sz w:val="20"/>
+        </w:rPr>
+        <w:t>Analysis rules:</w:t>
+      </w:r>
+    </w:p>
+    <w:p>
+      <w:pPr>
+        <w:rPr>
+          <w:rFonts w:ascii="Arial" w:hAnsi="Arial"/>
+          <w:iCs/>
+          <w:sz w:val="20"/>
+        </w:rPr>
+      </w:pPr>
+      <w:r>
+        <w:rPr>
+          <w:rFonts w:ascii="Arial" w:hAnsi="Arial"/>
+          <w:iCs/>
+          <w:sz w:val="20"/>
+        </w:rPr>
+        <w:lastRenderedPageBreak/>
+        <w:t>- For jobs marked “Yêu cầu kỹ năng AI/LLM/automation-AI: YES”, explain how AI directly changes the QA/QC role and what skills become more important, such as AI testing, LLM evaluation, automation, data-driven testing, prompt-based validation, or AI-assisted defect detection.</w:t>
+      </w:r>
+    </w:p>
+    <w:p>
+      <w:pPr>
+        <w:rPr>
+          <w:rFonts w:ascii="Arial" w:hAnsi="Arial"/>
+          <w:iCs/>
+          <w:sz w:val="20"/>
+        </w:rPr>
+      </w:pPr>
+      <w:r>
+        <w:rPr>
+          <w:rFonts w:ascii="Arial" w:hAnsi="Arial"/>
+          <w:iCs/>
+          <w:sz w:val="20"/>
+        </w:rPr>
+        <w:t>- For jobs marked “Yêu cầu kỹ năng AI/LLM/automation-AI: NO”, explain AI as a supporting tool rather than a required core skill.</w:t>
+      </w:r>
+    </w:p>
+    <w:p>
+      <w:pPr>
+        <w:rPr>
+          <w:rFonts w:ascii="Arial" w:hAnsi="Arial"/>
+          <w:iCs/>
+          <w:sz w:val="20"/>
+        </w:rPr>
+      </w:pPr>
+      <w:r>
+        <w:rPr>
+          <w:rFonts w:ascii="Arial" w:hAnsi="Arial"/>
+          <w:iCs/>
+          <w:sz w:val="20"/>
+        </w:rPr>
+        <w:t>- Do not claim AI fully replaces the QA/QC role unless the job description clearly supports that.</w:t>
+      </w:r>
+    </w:p>
+    <w:p>
+      <w:pPr>
+        <w:rPr>
+          <w:rFonts w:ascii="Arial" w:hAnsi="Arial"/>
+          <w:iCs/>
+          <w:sz w:val="20"/>
+        </w:rPr>
+      </w:pPr>
+      <w:r>
+        <w:rPr>
+          <w:rFonts w:ascii="Arial" w:hAnsi="Arial"/>
+          <w:iCs/>
+          <w:sz w:val="20"/>
+        </w:rPr>
+        <w:t>- Make the human responsibility clear, especially judgment, domain knowledge, defect triage, communication, compliance, quality audits, and final quality decisions.</w:t>
+      </w:r>
+    </w:p>
+    <w:p>
+      <w:pPr>
+        <w:rPr>
+          <w:rFonts w:ascii="Arial" w:hAnsi="Arial"/>
+          <w:iCs/>
+          <w:sz w:val="20"/>
+        </w:rPr>
+      </w:pPr>
+      <w:r>
+        <w:rPr>
+          <w:rFonts w:ascii="Arial" w:hAnsi="Arial"/>
+          <w:iCs/>
+          <w:sz w:val="20"/>
+        </w:rPr>
+        <w:t>- Mention practical QA/QC work when relevant, such as manual testing, automation testing, test case design, quality audits, defect detection, API testing, regression testing, risk-based testing, or process improvement.</w:t>
+      </w:r>
+    </w:p>
+    <w:p>
+      <w:pPr>
+        <w:rPr>
+          <w:rFonts w:ascii="Arial" w:hAnsi="Arial"/>
+          <w:iCs/>
+          <w:sz w:val="20"/>
+        </w:rPr>
+      </w:pPr>
+    </w:p>
+    <w:p>
+      <w:pPr>
+        <w:rPr>
+          <w:rFonts w:ascii="Arial" w:hAnsi="Arial"/>
+          <w:iCs/>
+          <w:sz w:val="20"/>
+        </w:rPr>
+      </w:pPr>
+      <w:r>
+        <w:rPr>
+          <w:rFonts w:ascii="Arial" w:hAnsi="Arial"/>
+          <w:iCs/>
+          <w:sz w:val="20"/>
+        </w:rPr>
+        <w:t>Before editing:</w:t>
+      </w:r>
+    </w:p>
+    <w:p>
+      <w:pPr>
+        <w:rPr>
+          <w:rFonts w:ascii="Arial" w:hAnsi="Arial"/>
+          <w:iCs/>
+          <w:sz w:val="20"/>
+        </w:rPr>
+      </w:pPr>
+      <w:r>
+        <w:rPr>
+          <w:rFonts w:ascii="Arial" w:hAnsi="Arial"/>
+          <w:iCs/>
+          <w:sz w:val="20"/>
+        </w:rPr>
+        <w:t>Show me the proposed AI Impact Analysis text for Job 1 through Job 10.</w:t>
+      </w:r>
+    </w:p>
+    <w:p>
+      <w:pPr>
+        <w:rPr>
+          <w:rFonts w:ascii="Arial" w:hAnsi="Arial"/>
+          <w:iCs/>
+          <w:sz w:val="20"/>
+        </w:rPr>
+      </w:pPr>
+    </w:p>
+    <w:p>
+      <w:pPr>
+        <w:rPr>
+          <w:rFonts w:ascii="Arial" w:hAnsi="Arial"/>
+          <w:iCs/>
+          <w:sz w:val="20"/>
+        </w:rPr>
+      </w:pPr>
+      <w:r>
+        <w:rPr>
+          <w:rFonts w:ascii="Arial" w:hAnsi="Arial"/>
+          <w:iCs/>
+          <w:sz w:val="20"/>
+        </w:rPr>
+        <w:t>After showing the proposed text:</w:t>
+      </w:r>
+    </w:p>
+    <w:p>
+      <w:pPr>
+        <w:rPr>
+          <w:rFonts w:ascii="Arial" w:hAnsi="Arial"/>
+          <w:iCs/>
+          <w:sz w:val="20"/>
+        </w:rPr>
+      </w:pPr>
+      <w:r>
+        <w:rPr>
+          <w:rFonts w:ascii="Arial" w:hAnsi="Arial"/>
+          <w:iCs/>
+          <w:sz w:val="20"/>
+        </w:rPr>
+        <w:t>Apply the edits directly to Report/requirement_1.md.</w:t>
+      </w:r>
+    </w:p>
+    <w:p>
+      <w:pPr>
+        <w:rPr>
+          <w:rFonts w:ascii="Arial" w:hAnsi="Arial"/>
+          <w:iCs/>
+          <w:sz w:val="20"/>
+        </w:rPr>
+      </w:pPr>
+    </w:p>
+    <w:p>
+      <w:pPr>
+        <w:rPr>
+          <w:rFonts w:ascii="Arial" w:hAnsi="Arial"/>
+          <w:iCs/>
+          <w:sz w:val="20"/>
+        </w:rPr>
+      </w:pPr>
+      <w:r>
+        <w:rPr>
+          <w:rFonts w:ascii="Arial" w:hAnsi="Arial"/>
+          <w:iCs/>
+          <w:sz w:val="20"/>
+        </w:rPr>
+        <w:t>Done when:</w:t>
+      </w:r>
+    </w:p>
+    <w:p>
+      <w:pPr>
+        <w:rPr>
+          <w:rFonts w:ascii="Arial" w:hAnsi="Arial"/>
+          <w:iCs/>
+          <w:sz w:val="20"/>
+        </w:rPr>
+      </w:pPr>
+      <w:r>
+        <w:rPr>
+          <w:rFonts w:ascii="Arial" w:hAnsi="Arial"/>
+          <w:iCs/>
+          <w:sz w:val="20"/>
+        </w:rPr>
+        <w:t>- All 10 TODO placeholders under “Phân tích tác động của AI” are replaced.</w:t>
+      </w:r>
+    </w:p>
+    <w:p>
+      <w:pPr>
+        <w:rPr>
+          <w:rFonts w:ascii="Arial" w:hAnsi="Arial"/>
+          <w:iCs/>
+          <w:sz w:val="20"/>
+        </w:rPr>
+      </w:pPr>
+      <w:r>
+        <w:rPr>
+          <w:rFonts w:ascii="Arial" w:hAnsi="Arial"/>
+          <w:iCs/>
+          <w:sz w:val="20"/>
+        </w:rPr>
+        <w:t>- Each job has a 1–2 sentence AI Impact Analysis.</w:t>
+      </w:r>
+    </w:p>
+    <w:p>
+      <w:pPr>
+        <w:rPr>
+          <w:rFonts w:ascii="Arial" w:hAnsi="Arial"/>
+          <w:iCs/>
+          <w:sz w:val="20"/>
+        </w:rPr>
+      </w:pPr>
+      <w:r>
+        <w:rPr>
+          <w:rFonts w:ascii="Arial" w:hAnsi="Arial"/>
+          <w:iCs/>
+          <w:sz w:val="20"/>
+        </w:rPr>
+        <w:t>- No unrelated content is changed.</w:t>
+      </w:r>
+    </w:p>
+    <w:p>
+      <w:pPr>
+        <w:rPr>
+          <w:rFonts w:ascii="Arial" w:hAnsi="Arial"/>
+          <w:iCs/>
+          <w:sz w:val="20"/>
+        </w:rPr>
+      </w:pPr>
+    </w:p>
+    <w:p>
+      <w:pPr>
+        <w:rPr>
+          <w:rFonts w:ascii="Arial" w:hAnsi="Arial"/>
+          <w:iCs/>
+          <w:sz w:val="20"/>
+        </w:rPr>
+      </w:pPr>
+      <w:r>
+        <w:rPr>
+          <w:rFonts w:ascii="Arial" w:hAnsi="Arial"/>
+          <w:iCs/>
+          <w:sz w:val="20"/>
+        </w:rPr>
+        <w:t>@Report/requirement_1.md @HW01.md</w:t>
+      </w:r>
+    </w:p>
+    <w:p>
+      <w:pPr>
+        <w:rPr>
+          <w:rFonts w:ascii="Arial" w:hAnsi="Arial"/>
+          <w:b/>
+          <w:bCs/>
+          <w:iCs/>
+          <w:sz w:val="20"/>
+        </w:rPr>
+      </w:pPr>
+      <w:r>
+        <w:rPr>
+          <w:rFonts w:ascii="Arial" w:hAnsi="Arial"/>
+          <w:b/>
+          <w:bCs/>
+          <w:iCs/>
+          <w:sz w:val="20"/>
+        </w:rPr>
+        <w:t>PROMPT 2 - Requirement 3 Student Fix for Weak Test Cases</w:t>
+      </w:r>
+    </w:p>
+    <w:p>
+      <w:pPr>
+        <w:rPr>
+          <w:rFonts w:ascii="Arial" w:hAnsi="Arial"/>
+          <w:iCs/>
+          <w:sz w:val="20"/>
+        </w:rPr>
+      </w:pPr>
+      <w:r>
+        <w:rPr>
+          <w:rFonts w:ascii="Arial" w:hAnsi="Arial"/>
+          <w:iCs/>
+          <w:sz w:val="20"/>
+        </w:rPr>
+        <w:t>You are helping me revise Requirement 3 of my Software Testing HW01 report.</w:t>
+      </w:r>
+    </w:p>
+    <w:p>
+      <w:pPr>
+        <w:rPr>
+          <w:rFonts w:ascii="Arial" w:hAnsi="Arial"/>
+          <w:iCs/>
+          <w:sz w:val="20"/>
+        </w:rPr>
+      </w:pPr>
+    </w:p>
+    <w:p>
+      <w:pPr>
+        <w:rPr>
+          <w:rFonts w:ascii="Arial" w:hAnsi="Arial"/>
+          <w:iCs/>
+          <w:sz w:val="20"/>
+        </w:rPr>
+      </w:pPr>
+      <w:r>
+        <w:rPr>
+          <w:rFonts w:ascii="Arial" w:hAnsi="Arial"/>
+          <w:iCs/>
+          <w:sz w:val="20"/>
+        </w:rPr>
+        <w:t>Context:</w:t>
+      </w:r>
+    </w:p>
+    <w:p>
+      <w:pPr>
+        <w:rPr>
+          <w:rFonts w:ascii="Arial" w:hAnsi="Arial"/>
+          <w:iCs/>
+          <w:sz w:val="20"/>
+        </w:rPr>
+      </w:pPr>
+      <w:r>
+        <w:rPr>
+          <w:rFonts w:ascii="Arial" w:hAnsi="Arial"/>
+          <w:iCs/>
+          <w:sz w:val="20"/>
+        </w:rPr>
+        <w:t>- The file to edit is Report/requirement_3.md.</w:t>
+      </w:r>
+    </w:p>
+    <w:p>
+      <w:pPr>
+        <w:rPr>
+          <w:rFonts w:ascii="Arial" w:hAnsi="Arial"/>
+          <w:iCs/>
+          <w:sz w:val="20"/>
+        </w:rPr>
+      </w:pPr>
+      <w:r>
+        <w:rPr>
+          <w:rFonts w:ascii="Arial" w:hAnsi="Arial"/>
+          <w:iCs/>
+          <w:sz w:val="20"/>
+        </w:rPr>
+        <w:t>- The product is a real rapid boil kettle / ấm siêu tốc.</w:t>
+      </w:r>
+    </w:p>
+    <w:p>
+      <w:pPr>
+        <w:rPr>
+          <w:rFonts w:ascii="Arial" w:hAnsi="Arial"/>
+          <w:iCs/>
+          <w:sz w:val="20"/>
+        </w:rPr>
+      </w:pPr>
+      <w:r>
+        <w:rPr>
+          <w:rFonts w:ascii="Arial" w:hAnsi="Arial"/>
+          <w:iCs/>
+          <w:sz w:val="20"/>
+        </w:rPr>
+        <w:lastRenderedPageBreak/>
+        <w:t>- The current 15 test cases were generated as an AI baseline.</w:t>
+      </w:r>
+    </w:p>
+    <w:p>
+      <w:pPr>
+        <w:rPr>
+          <w:rFonts w:ascii="Arial" w:hAnsi="Arial"/>
+          <w:iCs/>
+          <w:sz w:val="20"/>
+        </w:rPr>
+      </w:pPr>
+      <w:r>
+        <w:rPr>
+          <w:rFonts w:ascii="Arial" w:hAnsi="Arial"/>
+          <w:iCs/>
+          <w:sz w:val="20"/>
+        </w:rPr>
+        <w:t>- I reviewed the baseline as the student and found three weak test cases.</w:t>
+      </w:r>
+    </w:p>
+    <w:p>
+      <w:pPr>
+        <w:rPr>
+          <w:rFonts w:ascii="Arial" w:hAnsi="Arial"/>
+          <w:iCs/>
+          <w:sz w:val="20"/>
+        </w:rPr>
+      </w:pPr>
+      <w:r>
+        <w:rPr>
+          <w:rFonts w:ascii="Arial" w:hAnsi="Arial"/>
+          <w:iCs/>
+          <w:sz w:val="20"/>
+        </w:rPr>
+        <w:t>- This is a student-fix edit, not a full regeneration.</w:t>
+      </w:r>
+    </w:p>
+    <w:p>
+      <w:pPr>
+        <w:rPr>
+          <w:rFonts w:ascii="Arial" w:hAnsi="Arial"/>
+          <w:iCs/>
+          <w:sz w:val="20"/>
+        </w:rPr>
+      </w:pPr>
+    </w:p>
+    <w:p>
+      <w:pPr>
+        <w:rPr>
+          <w:rFonts w:ascii="Arial" w:hAnsi="Arial"/>
+          <w:iCs/>
+          <w:sz w:val="20"/>
+        </w:rPr>
+      </w:pPr>
+      <w:r>
+        <w:rPr>
+          <w:rFonts w:ascii="Arial" w:hAnsi="Arial"/>
+          <w:iCs/>
+          <w:sz w:val="20"/>
+        </w:rPr>
+        <w:t>Student review:</w:t>
+      </w:r>
+    </w:p>
+    <w:p>
+      <w:pPr>
+        <w:rPr>
+          <w:rFonts w:ascii="Arial" w:hAnsi="Arial"/>
+          <w:iCs/>
+          <w:sz w:val="20"/>
+        </w:rPr>
+      </w:pPr>
+      <w:r>
+        <w:rPr>
+          <w:rFonts w:ascii="Arial" w:hAnsi="Arial"/>
+          <w:iCs/>
+          <w:sz w:val="20"/>
+        </w:rPr>
+        <w:t>- TC-KETTLE-04 duplicates normal boiling behavior already covered by TC-KETTLE-01.</w:t>
+      </w:r>
+    </w:p>
+    <w:p>
+      <w:pPr>
+        <w:rPr>
+          <w:rFonts w:ascii="Arial" w:hAnsi="Arial"/>
+          <w:iCs/>
+          <w:sz w:val="20"/>
+        </w:rPr>
+      </w:pPr>
+      <w:r>
+        <w:rPr>
+          <w:rFonts w:ascii="Arial" w:hAnsi="Arial"/>
+          <w:iCs/>
+          <w:sz w:val="20"/>
+        </w:rPr>
+        <w:t>- TC-KETTLE-14 only checks product labels or safety symbols, which is useful evidence but not a strong behavior test.</w:t>
+      </w:r>
+    </w:p>
+    <w:p>
+      <w:pPr>
+        <w:rPr>
+          <w:rFonts w:ascii="Arial" w:hAnsi="Arial"/>
+          <w:iCs/>
+          <w:sz w:val="20"/>
+        </w:rPr>
+      </w:pPr>
+      <w:r>
+        <w:rPr>
+          <w:rFonts w:ascii="Arial" w:hAnsi="Arial"/>
+          <w:iCs/>
+          <w:sz w:val="20"/>
+        </w:rPr>
+        <w:t>- TC-KETTLE-15 checks external cleaning after use, which is more of a maintenance activity than a functional, safety, or boundary test.</w:t>
+      </w:r>
+    </w:p>
+    <w:p>
+      <w:pPr>
+        <w:rPr>
+          <w:rFonts w:ascii="Arial" w:hAnsi="Arial"/>
+          <w:iCs/>
+          <w:sz w:val="20"/>
+        </w:rPr>
+      </w:pPr>
+    </w:p>
+    <w:p>
+      <w:pPr>
+        <w:rPr>
+          <w:rFonts w:ascii="Arial" w:hAnsi="Arial"/>
+          <w:iCs/>
+          <w:sz w:val="20"/>
+        </w:rPr>
+      </w:pPr>
+      <w:r>
+        <w:rPr>
+          <w:rFonts w:ascii="Arial" w:hAnsi="Arial"/>
+          <w:iCs/>
+          <w:sz w:val="20"/>
+        </w:rPr>
+        <w:t>Task:</w:t>
+      </w:r>
+    </w:p>
+    <w:p>
+      <w:pPr>
+        <w:rPr>
+          <w:rFonts w:ascii="Arial" w:hAnsi="Arial"/>
+          <w:iCs/>
+          <w:sz w:val="20"/>
+        </w:rPr>
+      </w:pPr>
+      <w:r>
+        <w:rPr>
+          <w:rFonts w:ascii="Arial" w:hAnsi="Arial"/>
+          <w:iCs/>
+          <w:sz w:val="20"/>
+        </w:rPr>
+        <w:t>Replace TC-KETTLE-04, TC-KETTLE-14, and TC-KETTLE-15 with stronger test cases for a rapid boil kettle.</w:t>
+      </w:r>
+    </w:p>
+    <w:p>
+      <w:pPr>
+        <w:rPr>
+          <w:rFonts w:ascii="Arial" w:hAnsi="Arial"/>
+          <w:iCs/>
+          <w:sz w:val="20"/>
+        </w:rPr>
+      </w:pPr>
+    </w:p>
+    <w:p>
+      <w:pPr>
+        <w:rPr>
+          <w:rFonts w:ascii="Arial" w:hAnsi="Arial"/>
+          <w:iCs/>
+          <w:sz w:val="20"/>
+        </w:rPr>
+      </w:pPr>
+      <w:r>
+        <w:rPr>
+          <w:rFonts w:ascii="Arial" w:hAnsi="Arial"/>
+          <w:iCs/>
+          <w:sz w:val="20"/>
+        </w:rPr>
+        <w:t>Replacement requirements:</w:t>
+      </w:r>
+    </w:p>
+    <w:p>
+      <w:pPr>
+        <w:rPr>
+          <w:rFonts w:ascii="Arial" w:hAnsi="Arial"/>
+          <w:iCs/>
+          <w:sz w:val="20"/>
+        </w:rPr>
+      </w:pPr>
+      <w:r>
+        <w:rPr>
+          <w:rFonts w:ascii="Arial" w:hAnsi="Arial"/>
+          <w:iCs/>
+          <w:sz w:val="20"/>
+        </w:rPr>
+        <w:t>- The replacements must be realistic for a household rapid boil kettle.</w:t>
+      </w:r>
+    </w:p>
+    <w:p>
+      <w:pPr>
+        <w:rPr>
+          <w:rFonts w:ascii="Arial" w:hAnsi="Arial"/>
+          <w:iCs/>
+          <w:sz w:val="20"/>
+        </w:rPr>
+      </w:pPr>
+      <w:r>
+        <w:rPr>
+          <w:rFonts w:ascii="Arial" w:hAnsi="Arial"/>
+          <w:iCs/>
+          <w:sz w:val="20"/>
+        </w:rPr>
+        <w:t>- The replacements should improve functional, safety, boundary, or risk-based coverage.</w:t>
+      </w:r>
+    </w:p>
+    <w:p>
+      <w:pPr>
+        <w:rPr>
+          <w:rFonts w:ascii="Arial" w:hAnsi="Arial"/>
+          <w:iCs/>
+          <w:sz w:val="20"/>
+        </w:rPr>
+      </w:pPr>
+      <w:r>
+        <w:rPr>
+          <w:rFonts w:ascii="Arial" w:hAnsi="Arial"/>
+          <w:iCs/>
+          <w:sz w:val="20"/>
+        </w:rPr>
+        <w:t>- Prefer edge cases or user-behavior scenarios that are not already covered by the current baseline test list.</w:t>
+      </w:r>
+    </w:p>
+    <w:p>
+      <w:pPr>
+        <w:rPr>
+          <w:rFonts w:ascii="Arial" w:hAnsi="Arial"/>
+          <w:iCs/>
+          <w:sz w:val="20"/>
+        </w:rPr>
+      </w:pPr>
+      <w:r>
+        <w:rPr>
+          <w:rFonts w:ascii="Arial" w:hAnsi="Arial"/>
+          <w:iCs/>
+          <w:sz w:val="20"/>
+        </w:rPr>
+        <w:t>- Do not simply restate normal boiling, lid check, power-on check, auto shut-off, near-MIN, near-MAX, cable inspection, or pouring tests because those are already covered.</w:t>
+      </w:r>
+    </w:p>
+    <w:p>
+      <w:pPr>
+        <w:rPr>
+          <w:rFonts w:ascii="Arial" w:hAnsi="Arial"/>
+          <w:iCs/>
+          <w:sz w:val="20"/>
+        </w:rPr>
+      </w:pPr>
+      <w:r>
+        <w:rPr>
+          <w:rFonts w:ascii="Arial" w:hAnsi="Arial"/>
+          <w:iCs/>
+          <w:sz w:val="20"/>
+        </w:rPr>
+        <w:t>- The replacements must be safe to describe and safe to perform only under normal household supervision.</w:t>
+      </w:r>
+    </w:p>
+    <w:p>
+      <w:pPr>
+        <w:rPr>
+          <w:rFonts w:ascii="Arial" w:hAnsi="Arial"/>
+          <w:iCs/>
+          <w:sz w:val="20"/>
+        </w:rPr>
+      </w:pPr>
+      <w:r>
+        <w:rPr>
+          <w:rFonts w:ascii="Arial" w:hAnsi="Arial"/>
+          <w:iCs/>
+          <w:sz w:val="20"/>
+        </w:rPr>
+        <w:t>- Do not include dangerous destructive tests such as short-circuiting, touching live electrical contacts, damaging wiring, pouring water into electrical parts, or leaving the kettle unattended.</w:t>
+      </w:r>
+    </w:p>
+    <w:p>
+      <w:pPr>
+        <w:rPr>
+          <w:rFonts w:ascii="Arial" w:hAnsi="Arial"/>
+          <w:iCs/>
+          <w:sz w:val="20"/>
+        </w:rPr>
+      </w:pPr>
+    </w:p>
+    <w:p>
+      <w:pPr>
+        <w:rPr>
+          <w:rFonts w:ascii="Arial" w:hAnsi="Arial"/>
+          <w:iCs/>
+          <w:sz w:val="20"/>
+        </w:rPr>
+      </w:pPr>
+      <w:r>
+        <w:rPr>
+          <w:rFonts w:ascii="Arial" w:hAnsi="Arial"/>
+          <w:iCs/>
+          <w:sz w:val="20"/>
+        </w:rPr>
+        <w:t>Important constraints:</w:t>
+      </w:r>
+    </w:p>
+    <w:p>
+      <w:pPr>
+        <w:rPr>
+          <w:rFonts w:ascii="Arial" w:hAnsi="Arial"/>
+          <w:iCs/>
+          <w:sz w:val="20"/>
+        </w:rPr>
+      </w:pPr>
+      <w:r>
+        <w:rPr>
+          <w:rFonts w:ascii="Arial" w:hAnsi="Arial"/>
+          <w:iCs/>
+          <w:sz w:val="20"/>
+        </w:rPr>
+        <w:t>- Keep exactly 15 test cases.</w:t>
+      </w:r>
+    </w:p>
+    <w:p>
+      <w:pPr>
+        <w:rPr>
+          <w:rFonts w:ascii="Arial" w:hAnsi="Arial"/>
+          <w:iCs/>
+          <w:sz w:val="20"/>
+        </w:rPr>
+      </w:pPr>
+      <w:r>
+        <w:rPr>
+          <w:rFonts w:ascii="Arial" w:hAnsi="Arial"/>
+          <w:iCs/>
+          <w:sz w:val="20"/>
+        </w:rPr>
+        <w:t>- Only replace TC-KETTLE-04, TC-KETTLE-14, and TC-KETTLE-15 unless a small consistency update is required.</w:t>
+      </w:r>
+    </w:p>
+    <w:p>
+      <w:pPr>
+        <w:rPr>
+          <w:rFonts w:ascii="Arial" w:hAnsi="Arial"/>
+          <w:iCs/>
+          <w:sz w:val="20"/>
+        </w:rPr>
+      </w:pPr>
+      <w:r>
+        <w:rPr>
+          <w:rFonts w:ascii="Arial" w:hAnsi="Arial"/>
+          <w:iCs/>
+          <w:sz w:val="20"/>
+        </w:rPr>
+        <w:lastRenderedPageBreak/>
+        <w:t>- Do not fabricate actual results.</w:t>
+      </w:r>
+    </w:p>
+    <w:p>
+      <w:pPr>
+        <w:rPr>
+          <w:rFonts w:ascii="Arial" w:hAnsi="Arial"/>
+          <w:iCs/>
+          <w:sz w:val="20"/>
+        </w:rPr>
+      </w:pPr>
+      <w:r>
+        <w:rPr>
+          <w:rFonts w:ascii="Arial" w:hAnsi="Arial"/>
+          <w:iCs/>
+          <w:sz w:val="20"/>
+        </w:rPr>
+        <w:t>- Do not fabricate defects.</w:t>
+      </w:r>
+    </w:p>
+    <w:p>
+      <w:pPr>
+        <w:rPr>
+          <w:rFonts w:ascii="Arial" w:hAnsi="Arial"/>
+          <w:iCs/>
+          <w:sz w:val="20"/>
+        </w:rPr>
+      </w:pPr>
+      <w:r>
+        <w:rPr>
+          <w:rFonts w:ascii="Arial" w:hAnsi="Arial"/>
+          <w:iCs/>
+          <w:sz w:val="20"/>
+        </w:rPr>
+        <w:t>- Do not fabricate photos, screenshots, videos, GitHub Issues, dates, or evidence links.</w:t>
+      </w:r>
+    </w:p>
+    <w:p>
+      <w:pPr>
+        <w:rPr>
+          <w:rFonts w:ascii="Arial" w:hAnsi="Arial"/>
+          <w:iCs/>
+          <w:sz w:val="20"/>
+        </w:rPr>
+      </w:pPr>
+      <w:r>
+        <w:rPr>
+          <w:rFonts w:ascii="Arial" w:hAnsi="Arial"/>
+          <w:iCs/>
+          <w:sz w:val="20"/>
+        </w:rPr>
+        <w:t>- Keep Actual result and Verdict as placeholders or “Chưa thực thi” unless real execution data is provided.</w:t>
+      </w:r>
+    </w:p>
+    <w:p>
+      <w:pPr>
+        <w:rPr>
+          <w:rFonts w:ascii="Arial" w:hAnsi="Arial"/>
+          <w:iCs/>
+          <w:sz w:val="20"/>
+        </w:rPr>
+      </w:pPr>
+      <w:r>
+        <w:rPr>
+          <w:rFonts w:ascii="Arial" w:hAnsi="Arial"/>
+          <w:iCs/>
+          <w:sz w:val="20"/>
+        </w:rPr>
+        <w:t>- Use Vietnamese for the report text.</w:t>
+      </w:r>
+    </w:p>
+    <w:p>
+      <w:pPr>
+        <w:rPr>
+          <w:rFonts w:ascii="Arial" w:hAnsi="Arial"/>
+          <w:iCs/>
+          <w:sz w:val="20"/>
+        </w:rPr>
+      </w:pPr>
+      <w:r>
+        <w:rPr>
+          <w:rFonts w:ascii="Arial" w:hAnsi="Arial"/>
+          <w:iCs/>
+          <w:sz w:val="20"/>
+        </w:rPr>
+        <w:t>- Preserve Markdown table format.</w:t>
+      </w:r>
+    </w:p>
+    <w:p>
+      <w:pPr>
+        <w:rPr>
+          <w:rFonts w:ascii="Arial" w:hAnsi="Arial"/>
+          <w:iCs/>
+          <w:sz w:val="20"/>
+        </w:rPr>
+      </w:pPr>
+      <w:r>
+        <w:rPr>
+          <w:rFonts w:ascii="Arial" w:hAnsi="Arial"/>
+          <w:iCs/>
+          <w:sz w:val="20"/>
+        </w:rPr>
+        <w:t>- Only edit Report/requirement_3.md.</w:t>
+      </w:r>
+    </w:p>
+    <w:p>
+      <w:pPr>
+        <w:rPr>
+          <w:rFonts w:ascii="Arial" w:hAnsi="Arial"/>
+          <w:iCs/>
+          <w:sz w:val="20"/>
+        </w:rPr>
+      </w:pPr>
+    </w:p>
+    <w:p>
+      <w:pPr>
+        <w:rPr>
+          <w:rFonts w:ascii="Arial" w:hAnsi="Arial"/>
+          <w:iCs/>
+          <w:sz w:val="20"/>
+        </w:rPr>
+      </w:pPr>
+      <w:r>
+        <w:rPr>
+          <w:rFonts w:ascii="Arial" w:hAnsi="Arial"/>
+          <w:iCs/>
+          <w:sz w:val="20"/>
+        </w:rPr>
+        <w:t>For each replacement test case, include:</w:t>
+      </w:r>
+    </w:p>
+    <w:p>
+      <w:pPr>
+        <w:rPr>
+          <w:rFonts w:ascii="Arial" w:hAnsi="Arial"/>
+          <w:iCs/>
+          <w:sz w:val="20"/>
+        </w:rPr>
+      </w:pPr>
+      <w:r>
+        <w:rPr>
+          <w:rFonts w:ascii="Arial" w:hAnsi="Arial"/>
+          <w:iCs/>
+          <w:sz w:val="20"/>
+        </w:rPr>
+        <w:t>- ID</w:t>
+      </w:r>
+    </w:p>
+    <w:p>
+      <w:pPr>
+        <w:rPr>
+          <w:rFonts w:ascii="Arial" w:hAnsi="Arial"/>
+          <w:iCs/>
+          <w:sz w:val="20"/>
+        </w:rPr>
+      </w:pPr>
+      <w:r>
+        <w:rPr>
+          <w:rFonts w:ascii="Arial" w:hAnsi="Arial"/>
+          <w:iCs/>
+          <w:sz w:val="20"/>
+        </w:rPr>
+        <w:t>- Objective</w:t>
+      </w:r>
+    </w:p>
+    <w:p>
+      <w:pPr>
+        <w:rPr>
+          <w:rFonts w:ascii="Arial" w:hAnsi="Arial"/>
+          <w:iCs/>
+          <w:sz w:val="20"/>
+        </w:rPr>
+      </w:pPr>
+      <w:r>
+        <w:rPr>
+          <w:rFonts w:ascii="Arial" w:hAnsi="Arial"/>
+          <w:iCs/>
+          <w:sz w:val="20"/>
+        </w:rPr>
+        <w:t>- Input</w:t>
+      </w:r>
+    </w:p>
+    <w:p>
+      <w:pPr>
+        <w:rPr>
+          <w:rFonts w:ascii="Arial" w:hAnsi="Arial"/>
+          <w:iCs/>
+          <w:sz w:val="20"/>
+        </w:rPr>
+      </w:pPr>
+      <w:r>
+        <w:rPr>
+          <w:rFonts w:ascii="Arial" w:hAnsi="Arial"/>
+          <w:iCs/>
+          <w:sz w:val="20"/>
+        </w:rPr>
+        <w:t>- Steps</w:t>
+      </w:r>
+    </w:p>
+    <w:p>
+      <w:pPr>
+        <w:rPr>
+          <w:rFonts w:ascii="Arial" w:hAnsi="Arial"/>
+          <w:iCs/>
+          <w:sz w:val="20"/>
+        </w:rPr>
+      </w:pPr>
+      <w:r>
+        <w:rPr>
+          <w:rFonts w:ascii="Arial" w:hAnsi="Arial"/>
+          <w:iCs/>
+          <w:sz w:val="20"/>
+        </w:rPr>
+        <w:t>- Expected result</w:t>
+      </w:r>
+    </w:p>
+    <w:p>
+      <w:pPr>
+        <w:rPr>
+          <w:rFonts w:ascii="Arial" w:hAnsi="Arial"/>
+          <w:iCs/>
+          <w:sz w:val="20"/>
+        </w:rPr>
+      </w:pPr>
+      <w:r>
+        <w:rPr>
+          <w:rFonts w:ascii="Arial" w:hAnsi="Arial"/>
+          <w:iCs/>
+          <w:sz w:val="20"/>
+        </w:rPr>
+        <w:t>- Actual result</w:t>
+      </w:r>
+    </w:p>
+    <w:p>
+      <w:pPr>
+        <w:rPr>
+          <w:rFonts w:ascii="Arial" w:hAnsi="Arial"/>
+          <w:iCs/>
+          <w:sz w:val="20"/>
+        </w:rPr>
+      </w:pPr>
+      <w:r>
+        <w:rPr>
+          <w:rFonts w:ascii="Arial" w:hAnsi="Arial"/>
+          <w:iCs/>
+          <w:sz w:val="20"/>
+        </w:rPr>
+        <w:t>- Verdict</w:t>
+      </w:r>
+    </w:p>
+    <w:p>
+      <w:pPr>
+        <w:rPr>
+          <w:rFonts w:ascii="Arial" w:hAnsi="Arial"/>
+          <w:iCs/>
+          <w:sz w:val="20"/>
+        </w:rPr>
+      </w:pPr>
+      <w:r>
+        <w:rPr>
+          <w:rFonts w:ascii="Arial" w:hAnsi="Arial"/>
+          <w:iCs/>
+          <w:sz w:val="20"/>
+        </w:rPr>
+        <w:t>- Evidence/video link</w:t>
+      </w:r>
+    </w:p>
+    <w:p>
+      <w:pPr>
+        <w:rPr>
+          <w:rFonts w:ascii="Arial" w:hAnsi="Arial"/>
+          <w:iCs/>
+          <w:sz w:val="20"/>
+        </w:rPr>
+      </w:pPr>
+      <w:r>
+        <w:rPr>
+          <w:rFonts w:ascii="Arial" w:hAnsi="Arial"/>
+          <w:iCs/>
+          <w:sz w:val="20"/>
+        </w:rPr>
+        <w:t>- Ghi chú</w:t>
+      </w:r>
+    </w:p>
+    <w:p>
+      <w:pPr>
+        <w:rPr>
+          <w:rFonts w:ascii="Arial" w:hAnsi="Arial"/>
+          <w:iCs/>
+          <w:sz w:val="20"/>
+        </w:rPr>
+      </w:pPr>
+    </w:p>
+    <w:p>
+      <w:pPr>
+        <w:rPr>
+          <w:rFonts w:ascii="Arial" w:hAnsi="Arial"/>
+          <w:iCs/>
+          <w:sz w:val="20"/>
+        </w:rPr>
+      </w:pPr>
+      <w:r>
+        <w:rPr>
+          <w:rFonts w:ascii="Arial" w:hAnsi="Arial"/>
+          <w:iCs/>
+          <w:sz w:val="20"/>
+        </w:rPr>
+        <w:t>Also add a new section after GitHub Issues evidence:</w:t>
+      </w:r>
+    </w:p>
+    <w:p>
+      <w:pPr>
+        <w:rPr>
+          <w:rFonts w:ascii="Arial" w:hAnsi="Arial"/>
+          <w:iCs/>
+          <w:sz w:val="20"/>
+        </w:rPr>
+      </w:pPr>
+    </w:p>
+    <w:p>
+      <w:pPr>
+        <w:rPr>
+          <w:rFonts w:ascii="Arial" w:hAnsi="Arial"/>
+          <w:iCs/>
+          <w:sz w:val="20"/>
+        </w:rPr>
+      </w:pPr>
+      <w:r>
+        <w:rPr>
+          <w:rFonts w:ascii="Arial" w:hAnsi="Arial"/>
+          <w:iCs/>
+          <w:sz w:val="20"/>
+        </w:rPr>
+        <w:t>## 8. AI-missed edge cases</w:t>
+      </w:r>
+    </w:p>
+    <w:p>
+      <w:pPr>
+        <w:rPr>
+          <w:rFonts w:ascii="Arial" w:hAnsi="Arial"/>
+          <w:iCs/>
+          <w:sz w:val="20"/>
+        </w:rPr>
+      </w:pPr>
+    </w:p>
+    <w:p>
+      <w:pPr>
+        <w:rPr>
+          <w:rFonts w:ascii="Arial" w:hAnsi="Arial"/>
+          <w:iCs/>
+          <w:sz w:val="20"/>
+        </w:rPr>
+      </w:pPr>
+      <w:r>
+        <w:rPr>
+          <w:rFonts w:ascii="Arial" w:hAnsi="Arial"/>
+          <w:iCs/>
+          <w:sz w:val="20"/>
+        </w:rPr>
+        <w:t>In this section:</w:t>
+      </w:r>
+    </w:p>
+    <w:p>
+      <w:pPr>
+        <w:rPr>
+          <w:rFonts w:ascii="Arial" w:hAnsi="Arial"/>
+          <w:iCs/>
+          <w:sz w:val="20"/>
+        </w:rPr>
+      </w:pPr>
+      <w:r>
+        <w:rPr>
+          <w:rFonts w:ascii="Arial" w:hAnsi="Arial"/>
+          <w:iCs/>
+          <w:sz w:val="20"/>
+        </w:rPr>
+        <w:t>- Explain that the student reviewed the baseline AI output and found these three replacement cases were not generated by the baseline.</w:t>
+      </w:r>
+    </w:p>
+    <w:p>
+      <w:pPr>
+        <w:rPr>
+          <w:rFonts w:ascii="Arial" w:hAnsi="Arial"/>
+          <w:iCs/>
+          <w:sz w:val="20"/>
+        </w:rPr>
+      </w:pPr>
+      <w:r>
+        <w:rPr>
+          <w:rFonts w:ascii="Arial" w:hAnsi="Arial"/>
+          <w:iCs/>
+          <w:sz w:val="20"/>
+        </w:rPr>
+        <w:t>- Include exactly 3 entries, one for each replacement test case.</w:t>
+      </w:r>
+    </w:p>
+    <w:p>
+      <w:pPr>
+        <w:rPr>
+          <w:rFonts w:ascii="Arial" w:hAnsi="Arial"/>
+          <w:iCs/>
+          <w:sz w:val="20"/>
+        </w:rPr>
+      </w:pPr>
+      <w:r>
+        <w:rPr>
+          <w:rFonts w:ascii="Arial" w:hAnsi="Arial"/>
+          <w:iCs/>
+          <w:sz w:val="20"/>
+        </w:rPr>
+        <w:t>- Each entry must include:</w:t>
+      </w:r>
+    </w:p>
+    <w:p>
+      <w:pPr>
+        <w:rPr>
+          <w:rFonts w:ascii="Arial" w:hAnsi="Arial"/>
+          <w:iCs/>
+          <w:sz w:val="20"/>
+        </w:rPr>
+      </w:pPr>
+      <w:r>
+        <w:rPr>
+          <w:rFonts w:ascii="Arial" w:hAnsi="Arial"/>
+          <w:iCs/>
+          <w:sz w:val="20"/>
+        </w:rPr>
+        <w:lastRenderedPageBreak/>
+        <w:t>  - Related test case ID</w:t>
+      </w:r>
+    </w:p>
+    <w:p>
+      <w:pPr>
+        <w:rPr>
+          <w:rFonts w:ascii="Arial" w:hAnsi="Arial"/>
+          <w:iCs/>
+          <w:sz w:val="20"/>
+        </w:rPr>
+      </w:pPr>
+      <w:r>
+        <w:rPr>
+          <w:rFonts w:ascii="Arial" w:hAnsi="Arial"/>
+          <w:iCs/>
+          <w:sz w:val="20"/>
+        </w:rPr>
+        <w:t>  - Edge case description</w:t>
+      </w:r>
+    </w:p>
+    <w:p>
+      <w:pPr>
+        <w:rPr>
+          <w:rFonts w:ascii="Arial" w:hAnsi="Arial"/>
+          <w:iCs/>
+          <w:sz w:val="20"/>
+        </w:rPr>
+      </w:pPr>
+      <w:r>
+        <w:rPr>
+          <w:rFonts w:ascii="Arial" w:hAnsi="Arial"/>
+          <w:iCs/>
+          <w:sz w:val="20"/>
+        </w:rPr>
+        <w:t>  - Why the baseline AI likely missed it</w:t>
+      </w:r>
+    </w:p>
+    <w:p>
+      <w:pPr>
+        <w:rPr>
+          <w:rFonts w:ascii="Arial" w:hAnsi="Arial"/>
+          <w:iCs/>
+          <w:sz w:val="20"/>
+        </w:rPr>
+      </w:pPr>
+      <w:r>
+        <w:rPr>
+          <w:rFonts w:ascii="Arial" w:hAnsi="Arial"/>
+          <w:iCs/>
+          <w:sz w:val="20"/>
+        </w:rPr>
+        <w:t>  - Screenshot of AI conversation proving AI did not generate it: [STUDENT TODO: dán ảnh chụp hội thoại AI chứng minh AI không sinh edge case này]</w:t>
+      </w:r>
+    </w:p>
+    <w:p>
+      <w:pPr>
+        <w:rPr>
+          <w:rFonts w:ascii="Arial" w:hAnsi="Arial"/>
+          <w:iCs/>
+          <w:sz w:val="20"/>
+        </w:rPr>
+      </w:pPr>
+    </w:p>
+    <w:p>
+      <w:pPr>
+        <w:rPr>
+          <w:rFonts w:ascii="Arial" w:hAnsi="Arial"/>
+          <w:iCs/>
+          <w:sz w:val="20"/>
+        </w:rPr>
+      </w:pPr>
+      <w:r>
+        <w:rPr>
+          <w:rFonts w:ascii="Arial" w:hAnsi="Arial"/>
+          <w:iCs/>
+          <w:sz w:val="20"/>
+        </w:rPr>
+        <w:t>For the “why AI missed it” explanations:</w:t>
+      </w:r>
+    </w:p>
+    <w:p>
+      <w:pPr>
+        <w:rPr>
+          <w:rFonts w:ascii="Arial" w:hAnsi="Arial"/>
+          <w:iCs/>
+          <w:sz w:val="20"/>
+        </w:rPr>
+      </w:pPr>
+      <w:r>
+        <w:rPr>
+          <w:rFonts w:ascii="Arial" w:hAnsi="Arial"/>
+          <w:iCs/>
+          <w:sz w:val="20"/>
+        </w:rPr>
+        <w:t>- Be specific to the kettle and the current baseline output.</w:t>
+      </w:r>
+    </w:p>
+    <w:p>
+      <w:pPr>
+        <w:rPr>
+          <w:rFonts w:ascii="Arial" w:hAnsi="Arial"/>
+          <w:iCs/>
+          <w:sz w:val="20"/>
+        </w:rPr>
+      </w:pPr>
+      <w:r>
+        <w:rPr>
+          <w:rFonts w:ascii="Arial" w:hAnsi="Arial"/>
+          <w:iCs/>
+          <w:sz w:val="20"/>
+        </w:rPr>
+        <w:t>- Do not claim anything unsupported.</w:t>
+      </w:r>
+    </w:p>
+    <w:p>
+      <w:pPr>
+        <w:rPr>
+          <w:rFonts w:ascii="Arial" w:hAnsi="Arial"/>
+          <w:iCs/>
+          <w:sz w:val="20"/>
+        </w:rPr>
+      </w:pPr>
+      <w:r>
+        <w:rPr>
+          <w:rFonts w:ascii="Arial" w:hAnsi="Arial"/>
+          <w:iCs/>
+          <w:sz w:val="20"/>
+        </w:rPr>
+        <w:t>- Explain the gap in terms of risk-based testing, boundary behavior, or realistic user behavior.</w:t>
+      </w:r>
+    </w:p>
+    <w:p>
+      <w:pPr>
+        <w:rPr>
+          <w:rFonts w:ascii="Arial" w:hAnsi="Arial"/>
+          <w:iCs/>
+          <w:sz w:val="20"/>
+        </w:rPr>
+      </w:pPr>
+    </w:p>
+    <w:p>
+      <w:pPr>
+        <w:rPr>
+          <w:rFonts w:ascii="Arial" w:hAnsi="Arial"/>
+          <w:iCs/>
+          <w:sz w:val="20"/>
+        </w:rPr>
+      </w:pPr>
+      <w:r>
+        <w:rPr>
+          <w:rFonts w:ascii="Arial" w:hAnsi="Arial"/>
+          <w:iCs/>
+          <w:sz w:val="20"/>
+        </w:rPr>
+        <w:t>Update Section 5:</w:t>
+      </w:r>
+    </w:p>
+    <w:p>
+      <w:pPr>
+        <w:rPr>
+          <w:rFonts w:ascii="Arial" w:hAnsi="Arial"/>
+          <w:iCs/>
+          <w:sz w:val="20"/>
+        </w:rPr>
+      </w:pPr>
+      <w:r>
+        <w:rPr>
+          <w:rFonts w:ascii="Arial" w:hAnsi="Arial"/>
+          <w:iCs/>
+          <w:sz w:val="20"/>
+        </w:rPr>
+        <w:t>- Keep the planned executed tests safe and realistic.</w:t>
+      </w:r>
+    </w:p>
+    <w:p>
+      <w:pPr>
+        <w:rPr>
+          <w:rFonts w:ascii="Arial" w:hAnsi="Arial"/>
+          <w:iCs/>
+          <w:sz w:val="20"/>
+        </w:rPr>
+      </w:pPr>
+      <w:r>
+        <w:rPr>
+          <w:rFonts w:ascii="Arial" w:hAnsi="Arial"/>
+          <w:iCs/>
+          <w:sz w:val="20"/>
+        </w:rPr>
+        <w:t>- If any replaced test is potentially risky, do not include it in the 5 planned executed tests unless it can be performed safely.</w:t>
+      </w:r>
+    </w:p>
+    <w:p>
+      <w:pPr>
+        <w:rPr>
+          <w:rFonts w:ascii="Arial" w:hAnsi="Arial"/>
+          <w:iCs/>
+          <w:sz w:val="20"/>
+        </w:rPr>
+      </w:pPr>
+      <w:r>
+        <w:rPr>
+          <w:rFonts w:ascii="Arial" w:hAnsi="Arial"/>
+          <w:iCs/>
+          <w:sz w:val="20"/>
+        </w:rPr>
+        <w:t>- Keep at least 5 planned executed tests.</w:t>
+      </w:r>
+    </w:p>
+    <w:p>
+      <w:pPr>
+        <w:rPr>
+          <w:rFonts w:ascii="Arial" w:hAnsi="Arial"/>
+          <w:iCs/>
+          <w:sz w:val="20"/>
+        </w:rPr>
+      </w:pPr>
+    </w:p>
+    <w:p>
+      <w:pPr>
+        <w:rPr>
+          <w:rFonts w:ascii="Arial" w:hAnsi="Arial"/>
+          <w:iCs/>
+          <w:sz w:val="20"/>
+        </w:rPr>
+      </w:pPr>
+      <w:r>
+        <w:rPr>
+          <w:rFonts w:ascii="Arial" w:hAnsi="Arial"/>
+          <w:iCs/>
+          <w:sz w:val="20"/>
+        </w:rPr>
+        <w:t>Done when:</w:t>
+      </w:r>
+    </w:p>
+    <w:p>
+      <w:pPr>
+        <w:rPr>
+          <w:rFonts w:ascii="Arial" w:hAnsi="Arial"/>
+          <w:iCs/>
+          <w:sz w:val="20"/>
+        </w:rPr>
+      </w:pPr>
+      <w:r>
+        <w:rPr>
+          <w:rFonts w:ascii="Arial" w:hAnsi="Arial"/>
+          <w:iCs/>
+          <w:sz w:val="20"/>
+        </w:rPr>
+        <w:t>- TC-KETTLE-04, TC-KETTLE-14, and TC-KETTLE-15 are replaced with stronger kettle-specific tests.</w:t>
+      </w:r>
+    </w:p>
+    <w:p>
+      <w:pPr>
+        <w:rPr>
+          <w:rFonts w:ascii="Arial" w:hAnsi="Arial"/>
+          <w:iCs/>
+          <w:sz w:val="20"/>
+        </w:rPr>
+      </w:pPr>
+      <w:r>
+        <w:rPr>
+          <w:rFonts w:ascii="Arial" w:hAnsi="Arial"/>
+          <w:iCs/>
+          <w:sz w:val="20"/>
+        </w:rPr>
+        <w:t>- Section 8 contains 3 AI-missed edge cases based on the replacements.</w:t>
+      </w:r>
+    </w:p>
+    <w:p>
+      <w:pPr>
+        <w:rPr>
+          <w:rFonts w:ascii="Arial" w:hAnsi="Arial"/>
+          <w:iCs/>
+          <w:sz w:val="20"/>
+        </w:rPr>
+      </w:pPr>
+      <w:r>
+        <w:rPr>
+          <w:rFonts w:ascii="Arial" w:hAnsi="Arial"/>
+          <w:iCs/>
+          <w:sz w:val="20"/>
+        </w:rPr>
+        <w:t>- Section 5 still has at least 5 planned executed tests.</w:t>
+      </w:r>
+    </w:p>
+    <w:p>
+      <w:pPr>
+        <w:rPr>
+          <w:rFonts w:ascii="Arial" w:hAnsi="Arial"/>
+          <w:iCs/>
+          <w:sz w:val="20"/>
+        </w:rPr>
+      </w:pPr>
+      <w:r>
+        <w:rPr>
+          <w:rFonts w:ascii="Arial" w:hAnsi="Arial"/>
+          <w:iCs/>
+          <w:sz w:val="20"/>
+        </w:rPr>
+        <w:t>- The report still has exactly 15 test cases.</w:t>
+      </w:r>
+    </w:p>
+    <w:p>
+      <w:pPr>
+        <w:rPr>
+          <w:rFonts w:ascii="Arial" w:hAnsi="Arial"/>
+          <w:iCs/>
+          <w:sz w:val="20"/>
+        </w:rPr>
+      </w:pPr>
+      <w:r>
+        <w:rPr>
+          <w:rFonts w:ascii="Arial" w:hAnsi="Arial"/>
+          <w:iCs/>
+          <w:sz w:val="20"/>
+        </w:rPr>
+        <w:t>- No fake actual results, evidence, defects, screenshots, or GitHub Issues are added.</w:t>
+      </w:r>
+    </w:p>
+    <w:p>
+      <w:pPr>
+        <w:rPr>
+          <w:rFonts w:ascii="Arial" w:hAnsi="Arial"/>
+          <w:b/>
+          <w:bCs/>
+          <w:iCs/>
+          <w:sz w:val="20"/>
+        </w:rPr>
+      </w:pPr>
+      <w:r>
+        <w:rPr>
+          <w:rFonts w:ascii="Arial" w:hAnsi="Arial"/>
+          <w:b/>
+          <w:bCs/>
+          <w:iCs/>
+          <w:sz w:val="20"/>
+        </w:rPr>
+        <w:t>PROMPT 3 - Requirement 2 AI Hallucination Instance Audit</w:t>
+      </w:r>
+    </w:p>
+    <w:p>
+      <w:pPr>
+        <w:rPr>
+          <w:rFonts w:ascii="Arial" w:hAnsi="Arial"/>
+          <w:iCs/>
+          <w:sz w:val="20"/>
+        </w:rPr>
+      </w:pPr>
+      <w:r>
+        <w:rPr>
+          <w:rFonts w:ascii="Arial" w:hAnsi="Arial"/>
+          <w:iCs/>
+          <w:sz w:val="20"/>
+        </w:rPr>
+        <w:t>You are auditing my HW01 Requirement 2 work.</w:t>
+      </w:r>
+    </w:p>
+    <w:p>
+      <w:pPr>
+        <w:rPr>
+          <w:rFonts w:ascii="Arial" w:hAnsi="Arial"/>
+          <w:iCs/>
+          <w:sz w:val="20"/>
+        </w:rPr>
+      </w:pPr>
+    </w:p>
+    <w:p>
+      <w:pPr>
+        <w:rPr>
+          <w:rFonts w:ascii="Arial" w:hAnsi="Arial"/>
+          <w:iCs/>
+          <w:sz w:val="20"/>
+        </w:rPr>
+      </w:pPr>
+      <w:r>
+        <w:rPr>
+          <w:rFonts w:ascii="Arial" w:hAnsi="Arial"/>
+          <w:iCs/>
+          <w:sz w:val="20"/>
+        </w:rPr>
+        <w:t>Assignment rule:</w:t>
+      </w:r>
+    </w:p>
+    <w:p>
+      <w:pPr>
+        <w:rPr>
+          <w:rFonts w:ascii="Arial" w:hAnsi="Arial"/>
+          <w:iCs/>
+          <w:sz w:val="20"/>
+        </w:rPr>
+      </w:pPr>
+      <w:r>
+        <w:rPr>
+          <w:rFonts w:ascii="Arial" w:hAnsi="Arial"/>
+          <w:iCs/>
+          <w:sz w:val="20"/>
+        </w:rPr>
+        <w:t>For each of the 20 software defect entries, I must identify 1 place where the AI was biased or hallucinated when explaining that specific defect. This means 20 separate instances total.</w:t>
+      </w:r>
+    </w:p>
+    <w:p>
+      <w:pPr>
+        <w:rPr>
+          <w:rFonts w:ascii="Arial" w:hAnsi="Arial"/>
+          <w:iCs/>
+          <w:sz w:val="20"/>
+        </w:rPr>
+      </w:pPr>
+    </w:p>
+    <w:p>
+      <w:pPr>
+        <w:rPr>
+          <w:rFonts w:ascii="Arial" w:hAnsi="Arial"/>
+          <w:iCs/>
+          <w:sz w:val="20"/>
+        </w:rPr>
+      </w:pPr>
+      <w:r>
+        <w:rPr>
+          <w:rFonts w:ascii="Arial" w:hAnsi="Arial"/>
+          <w:iCs/>
+          <w:sz w:val="20"/>
+        </w:rPr>
+        <w:t>Important interpretation:</w:t>
+      </w:r>
+    </w:p>
+    <w:p>
+      <w:pPr>
+        <w:rPr>
+          <w:rFonts w:ascii="Arial" w:hAnsi="Arial"/>
+          <w:iCs/>
+          <w:sz w:val="20"/>
+        </w:rPr>
+      </w:pPr>
+      <w:r>
+        <w:rPr>
+          <w:rFonts w:ascii="Arial" w:hAnsi="Arial"/>
+          <w:iCs/>
+          <w:sz w:val="20"/>
+        </w:rPr>
+        <w:t>A small AI issue is acceptable if it is real and evidence-based. It can be a minor hallucination, bias, overgeneralization, unsupported wording, missing qualifier, or misleading simplification. However, do not fabricate issues. If there is no real issue visible from the provided texts, say so.</w:t>
+      </w:r>
+    </w:p>
+    <w:p>
+      <w:pPr>
+        <w:rPr>
+          <w:rFonts w:ascii="Arial" w:hAnsi="Arial"/>
+          <w:iCs/>
+          <w:sz w:val="20"/>
+        </w:rPr>
+      </w:pPr>
+    </w:p>
+    <w:p>
+      <w:pPr>
+        <w:rPr>
+          <w:rFonts w:ascii="Arial" w:hAnsi="Arial"/>
+          <w:iCs/>
+          <w:sz w:val="20"/>
+        </w:rPr>
+      </w:pPr>
+      <w:r>
+        <w:rPr>
+          <w:rFonts w:ascii="Arial" w:hAnsi="Arial"/>
+          <w:iCs/>
+          <w:sz w:val="20"/>
+        </w:rPr>
+        <w:t>I will provide two texts:</w:t>
+      </w:r>
+    </w:p>
+    <w:p>
+      <w:pPr>
+        <w:rPr>
+          <w:rFonts w:ascii="Arial" w:hAnsi="Arial"/>
+          <w:iCs/>
+          <w:sz w:val="20"/>
+        </w:rPr>
+      </w:pPr>
+      <w:r>
+        <w:rPr>
+          <w:rFonts w:ascii="Arial" w:hAnsi="Arial"/>
+          <w:iCs/>
+          <w:sz w:val="20"/>
+        </w:rPr>
+        <w:t>1. Appendix_A/prompt_log.md — Entry 4: AI Explanation Drafts for Hallucination Checking.</w:t>
+      </w:r>
+    </w:p>
+    <w:p>
+      <w:pPr>
+        <w:rPr>
+          <w:rFonts w:ascii="Arial" w:hAnsi="Arial"/>
+          <w:iCs/>
+          <w:sz w:val="20"/>
+        </w:rPr>
+      </w:pPr>
+      <w:r>
+        <w:rPr>
+          <w:rFonts w:ascii="Arial" w:hAnsi="Arial"/>
+          <w:iCs/>
+          <w:sz w:val="20"/>
+        </w:rPr>
+        <w:t>2. Report/requirement_2.md — my final Requirement 2 report.</w:t>
+      </w:r>
+    </w:p>
+    <w:p>
+      <w:pPr>
+        <w:rPr>
+          <w:rFonts w:ascii="Arial" w:hAnsi="Arial"/>
+          <w:iCs/>
+          <w:sz w:val="20"/>
+        </w:rPr>
+      </w:pPr>
+    </w:p>
+    <w:p>
+      <w:pPr>
+        <w:rPr>
+          <w:rFonts w:ascii="Arial" w:hAnsi="Arial"/>
+          <w:iCs/>
+          <w:sz w:val="20"/>
+        </w:rPr>
+      </w:pPr>
+      <w:r>
+        <w:rPr>
+          <w:rFonts w:ascii="Arial" w:hAnsi="Arial"/>
+          <w:iCs/>
+          <w:sz w:val="20"/>
+        </w:rPr>
+        <w:t>Your task:</w:t>
+      </w:r>
+    </w:p>
+    <w:p>
+      <w:pPr>
+        <w:rPr>
+          <w:rFonts w:ascii="Arial" w:hAnsi="Arial"/>
+          <w:iCs/>
+          <w:sz w:val="20"/>
+        </w:rPr>
+      </w:pPr>
+      <w:r>
+        <w:rPr>
+          <w:rFonts w:ascii="Arial" w:hAnsi="Arial"/>
+          <w:iCs/>
+          <w:sz w:val="20"/>
+        </w:rPr>
+        <w:t>Compare the AI explanation in Entry 4 against the final Requirement 2 report. For each of the 20 defects, determine whether the final report’s “AI Hallucination Instance” or equivalent section identifies a real AI mistake.</w:t>
+      </w:r>
+    </w:p>
+    <w:p>
+      <w:pPr>
+        <w:rPr>
+          <w:rFonts w:ascii="Arial" w:hAnsi="Arial"/>
+          <w:iCs/>
+          <w:sz w:val="20"/>
+        </w:rPr>
+      </w:pPr>
+    </w:p>
+    <w:p>
+      <w:pPr>
+        <w:rPr>
+          <w:rFonts w:ascii="Arial" w:hAnsi="Arial"/>
+          <w:iCs/>
+          <w:sz w:val="20"/>
+        </w:rPr>
+      </w:pPr>
+      <w:r>
+        <w:rPr>
+          <w:rFonts w:ascii="Arial" w:hAnsi="Arial"/>
+          <w:iCs/>
+          <w:sz w:val="20"/>
+        </w:rPr>
+        <w:t>Rules:</w:t>
+      </w:r>
+    </w:p>
+    <w:p>
+      <w:pPr>
+        <w:rPr>
+          <w:rFonts w:ascii="Arial" w:hAnsi="Arial"/>
+          <w:iCs/>
+          <w:sz w:val="20"/>
+        </w:rPr>
+      </w:pPr>
+      <w:r>
+        <w:rPr>
+          <w:rFonts w:ascii="Arial" w:hAnsi="Arial"/>
+          <w:iCs/>
+          <w:sz w:val="20"/>
+        </w:rPr>
+        <w:t>- Use only the two provided texts.</w:t>
+      </w:r>
+    </w:p>
+    <w:p>
+      <w:pPr>
+        <w:rPr>
+          <w:rFonts w:ascii="Arial" w:hAnsi="Arial"/>
+          <w:iCs/>
+          <w:sz w:val="20"/>
+        </w:rPr>
+      </w:pPr>
+      <w:r>
+        <w:rPr>
+          <w:rFonts w:ascii="Arial" w:hAnsi="Arial"/>
+          <w:iCs/>
+          <w:sz w:val="20"/>
+        </w:rPr>
+        <w:t>- Do not browse the web.</w:t>
+      </w:r>
+    </w:p>
+    <w:p>
+      <w:pPr>
+        <w:rPr>
+          <w:rFonts w:ascii="Arial" w:hAnsi="Arial"/>
+          <w:iCs/>
+          <w:sz w:val="20"/>
+        </w:rPr>
+      </w:pPr>
+      <w:r>
+        <w:rPr>
+          <w:rFonts w:ascii="Arial" w:hAnsi="Arial"/>
+          <w:iCs/>
+          <w:sz w:val="20"/>
+        </w:rPr>
+        <w:t>- Do not invent source facts.</w:t>
+      </w:r>
+    </w:p>
+    <w:p>
+      <w:pPr>
+        <w:rPr>
+          <w:rFonts w:ascii="Arial" w:hAnsi="Arial"/>
+          <w:iCs/>
+          <w:sz w:val="20"/>
+        </w:rPr>
+      </w:pPr>
+      <w:r>
+        <w:rPr>
+          <w:rFonts w:ascii="Arial" w:hAnsi="Arial"/>
+          <w:iCs/>
+          <w:sz w:val="20"/>
+        </w:rPr>
+        <w:t>- Do not force a hallucination/bias finding if the evidence is weak.</w:t>
+      </w:r>
+    </w:p>
+    <w:p>
+      <w:pPr>
+        <w:rPr>
+          <w:rFonts w:ascii="Arial" w:hAnsi="Arial"/>
+          <w:iCs/>
+          <w:sz w:val="20"/>
+        </w:rPr>
+      </w:pPr>
+      <w:r>
+        <w:rPr>
+          <w:rFonts w:ascii="Arial" w:hAnsi="Arial"/>
+          <w:iCs/>
+          <w:sz w:val="20"/>
+        </w:rPr>
+        <w:t>- A small issue counts if it is supported by the text.</w:t>
+      </w:r>
+    </w:p>
+    <w:p>
+      <w:pPr>
+        <w:rPr>
+          <w:rFonts w:ascii="Arial" w:hAnsi="Arial"/>
+          <w:iCs/>
+          <w:sz w:val="20"/>
+        </w:rPr>
+      </w:pPr>
+      <w:r>
+        <w:rPr>
+          <w:rFonts w:ascii="Arial" w:hAnsi="Arial"/>
+          <w:iCs/>
+          <w:sz w:val="20"/>
+        </w:rPr>
+        <w:t>- If the AI statement is broadly correct but too vague, classify it as “minor omission/simplification.”</w:t>
+      </w:r>
+    </w:p>
+    <w:p>
+      <w:pPr>
+        <w:rPr>
+          <w:rFonts w:ascii="Arial" w:hAnsi="Arial"/>
+          <w:iCs/>
+          <w:sz w:val="20"/>
+        </w:rPr>
+      </w:pPr>
+      <w:r>
+        <w:rPr>
+          <w:rFonts w:ascii="Arial" w:hAnsi="Arial"/>
+          <w:iCs/>
+          <w:sz w:val="20"/>
+        </w:rPr>
+        <w:t>- If the AI adds unsupported details, wrong facts, wrong causality, wrong scope, or invented consequences, classify it as “hallucination.”</w:t>
+      </w:r>
+    </w:p>
+    <w:p>
+      <w:pPr>
+        <w:rPr>
+          <w:rFonts w:ascii="Arial" w:hAnsi="Arial"/>
+          <w:iCs/>
+          <w:sz w:val="20"/>
+        </w:rPr>
+      </w:pPr>
+      <w:r>
+        <w:rPr>
+          <w:rFonts w:ascii="Arial" w:hAnsi="Arial"/>
+          <w:iCs/>
+          <w:sz w:val="20"/>
+        </w:rPr>
+        <w:t>- If the AI overgeneralizes, frames responsibility unfairly, ignores affected groups, or uses one-sided language, classify it as “bias.”</w:t>
+      </w:r>
+    </w:p>
+    <w:p>
+      <w:pPr>
+        <w:rPr>
+          <w:rFonts w:ascii="Arial" w:hAnsi="Arial"/>
+          <w:iCs/>
+          <w:sz w:val="20"/>
+        </w:rPr>
+      </w:pPr>
+      <w:r>
+        <w:rPr>
+          <w:rFonts w:ascii="Arial" w:hAnsi="Arial"/>
+          <w:iCs/>
+          <w:sz w:val="20"/>
+        </w:rPr>
+        <w:t>- If the final report’s finding is not defensible from the provided texts, mark it “needs revision.”</w:t>
+      </w:r>
+    </w:p>
+    <w:p>
+      <w:pPr>
+        <w:rPr>
+          <w:rFonts w:ascii="Arial" w:hAnsi="Arial"/>
+          <w:iCs/>
+          <w:sz w:val="20"/>
+        </w:rPr>
+      </w:pPr>
+    </w:p>
+    <w:p>
+      <w:pPr>
+        <w:rPr>
+          <w:rFonts w:ascii="Arial" w:hAnsi="Arial"/>
+          <w:iCs/>
+          <w:sz w:val="20"/>
+        </w:rPr>
+      </w:pPr>
+      <w:r>
+        <w:rPr>
+          <w:rFonts w:ascii="Arial" w:hAnsi="Arial"/>
+          <w:iCs/>
+          <w:sz w:val="20"/>
+        </w:rPr>
+        <w:t>Output format:</w:t>
+      </w:r>
+    </w:p>
+    <w:p>
+      <w:pPr>
+        <w:rPr>
+          <w:rFonts w:ascii="Arial" w:hAnsi="Arial"/>
+          <w:iCs/>
+          <w:sz w:val="20"/>
+        </w:rPr>
+      </w:pPr>
+      <w:r>
+        <w:rPr>
+          <w:rFonts w:ascii="Arial" w:hAnsi="Arial"/>
+          <w:iCs/>
+          <w:sz w:val="20"/>
+        </w:rPr>
+        <w:t>Review all 20 defects in this exact format:</w:t>
+      </w:r>
+    </w:p>
+    <w:p>
+      <w:pPr>
+        <w:rPr>
+          <w:rFonts w:ascii="Arial" w:hAnsi="Arial"/>
+          <w:iCs/>
+          <w:sz w:val="20"/>
+        </w:rPr>
+      </w:pPr>
+    </w:p>
+    <w:p>
+      <w:pPr>
+        <w:rPr>
+          <w:rFonts w:ascii="Arial" w:hAnsi="Arial"/>
+          <w:iCs/>
+          <w:sz w:val="20"/>
+        </w:rPr>
+      </w:pPr>
+      <w:r>
+        <w:rPr>
+          <w:rFonts w:ascii="Arial" w:hAnsi="Arial"/>
+          <w:iCs/>
+          <w:sz w:val="20"/>
+        </w:rPr>
+        <w:t>Defect [number] – [name]</w:t>
+      </w:r>
+    </w:p>
+    <w:p>
+      <w:pPr>
+        <w:rPr>
+          <w:rFonts w:ascii="Arial" w:hAnsi="Arial"/>
+          <w:iCs/>
+          <w:sz w:val="20"/>
+        </w:rPr>
+      </w:pPr>
+      <w:r>
+        <w:rPr>
+          <w:rFonts w:ascii="Arial" w:hAnsi="Arial"/>
+          <w:iCs/>
+          <w:sz w:val="20"/>
+        </w:rPr>
+        <w:t>- Valid instance?: Yes / Partial / No</w:t>
+      </w:r>
+    </w:p>
+    <w:p>
+      <w:pPr>
+        <w:rPr>
+          <w:rFonts w:ascii="Arial" w:hAnsi="Arial"/>
+          <w:iCs/>
+          <w:sz w:val="20"/>
+        </w:rPr>
+      </w:pPr>
+      <w:r>
+        <w:rPr>
+          <w:rFonts w:ascii="Arial" w:hAnsi="Arial"/>
+          <w:iCs/>
+          <w:sz w:val="20"/>
+        </w:rPr>
+        <w:t>- Type: Hallucination / Bias / Minor omission or simplification / Unsupported finding</w:t>
+      </w:r>
+    </w:p>
+    <w:p>
+      <w:pPr>
+        <w:rPr>
+          <w:rFonts w:ascii="Arial" w:hAnsi="Arial"/>
+          <w:iCs/>
+          <w:sz w:val="20"/>
+        </w:rPr>
+      </w:pPr>
+      <w:r>
+        <w:rPr>
+          <w:rFonts w:ascii="Arial" w:hAnsi="Arial"/>
+          <w:iCs/>
+          <w:sz w:val="20"/>
+        </w:rPr>
+        <w:t>- Evidence from Entry 4 AI output:</w:t>
+      </w:r>
+    </w:p>
+    <w:p>
+      <w:pPr>
+        <w:rPr>
+          <w:rFonts w:ascii="Arial" w:hAnsi="Arial"/>
+          <w:iCs/>
+          <w:sz w:val="20"/>
+        </w:rPr>
+      </w:pPr>
+      <w:r>
+        <w:rPr>
+          <w:rFonts w:ascii="Arial" w:hAnsi="Arial"/>
+          <w:iCs/>
+          <w:sz w:val="20"/>
+        </w:rPr>
+        <w:t>- Evidence from final report:</w:t>
+      </w:r>
+    </w:p>
+    <w:p>
+      <w:pPr>
+        <w:rPr>
+          <w:rFonts w:ascii="Arial" w:hAnsi="Arial"/>
+          <w:iCs/>
+          <w:sz w:val="20"/>
+        </w:rPr>
+      </w:pPr>
+      <w:r>
+        <w:rPr>
+          <w:rFonts w:ascii="Arial" w:hAnsi="Arial"/>
+          <w:iCs/>
+          <w:sz w:val="20"/>
+        </w:rPr>
+        <w:t>- Judgment:</w:t>
+      </w:r>
+    </w:p>
+    <w:p>
+      <w:pPr>
+        <w:rPr>
+          <w:rFonts w:ascii="Arial" w:hAnsi="Arial"/>
+          <w:iCs/>
+          <w:sz w:val="20"/>
+        </w:rPr>
+      </w:pPr>
+      <w:r>
+        <w:rPr>
+          <w:rFonts w:ascii="Arial" w:hAnsi="Arial"/>
+          <w:iCs/>
+          <w:sz w:val="20"/>
+        </w:rPr>
+        <w:t>- If needed, suggested safer rewrite:</w:t>
+      </w:r>
+    </w:p>
+    <w:p>
+      <w:pPr>
+        <w:rPr>
+          <w:rFonts w:ascii="Arial" w:hAnsi="Arial"/>
+          <w:iCs/>
+          <w:sz w:val="20"/>
+        </w:rPr>
+      </w:pPr>
+    </w:p>
+    <w:p>
+      <w:pPr>
+        <w:rPr>
+          <w:rFonts w:ascii="Arial" w:hAnsi="Arial"/>
+          <w:iCs/>
+          <w:sz w:val="20"/>
+        </w:rPr>
+      </w:pPr>
+      <w:r>
+        <w:rPr>
+          <w:rFonts w:ascii="Arial" w:hAnsi="Arial"/>
+          <w:iCs/>
+          <w:sz w:val="20"/>
+        </w:rPr>
+        <w:t>After all 20, provide:</w:t>
+      </w:r>
+    </w:p>
+    <w:p>
+      <w:pPr>
+        <w:rPr>
+          <w:rFonts w:ascii="Arial" w:hAnsi="Arial"/>
+          <w:iCs/>
+          <w:sz w:val="20"/>
+        </w:rPr>
+      </w:pPr>
+      <w:r>
+        <w:rPr>
+          <w:rFonts w:ascii="Arial" w:hAnsi="Arial"/>
+          <w:iCs/>
+          <w:sz w:val="20"/>
+        </w:rPr>
+        <w:t>- Total valid instances:</w:t>
+      </w:r>
+    </w:p>
+    <w:p>
+      <w:pPr>
+        <w:rPr>
+          <w:rFonts w:ascii="Arial" w:hAnsi="Arial"/>
+          <w:iCs/>
+          <w:sz w:val="20"/>
+        </w:rPr>
+      </w:pPr>
+      <w:r>
+        <w:rPr>
+          <w:rFonts w:ascii="Arial" w:hAnsi="Arial"/>
+          <w:iCs/>
+          <w:sz w:val="20"/>
+        </w:rPr>
+        <w:t>- Entries that need revision:</w:t>
+      </w:r>
+    </w:p>
+    <w:p>
+      <w:pPr>
+        <w:rPr>
+          <w:rFonts w:ascii="Arial" w:hAnsi="Arial"/>
+          <w:iCs/>
+          <w:sz w:val="20"/>
+        </w:rPr>
+      </w:pPr>
+      <w:r>
+        <w:rPr>
+          <w:rFonts w:ascii="Arial" w:hAnsi="Arial"/>
+          <w:iCs/>
+          <w:sz w:val="20"/>
+        </w:rPr>
+        <w:t>- Final verdict: Meets requirement / Does not fully meet requirement yet</w:t>
+      </w:r>
+    </w:p>
+    <w:p>
+      <w:pPr>
+        <w:rPr>
+          <w:rFonts w:ascii="Arial" w:hAnsi="Arial"/>
+          <w:iCs/>
+          <w:sz w:val="20"/>
+        </w:rPr>
+      </w:pPr>
+      <w:r>
+        <w:rPr>
+          <w:rFonts w:ascii="Arial" w:hAnsi="Arial"/>
+          <w:iCs/>
+          <w:sz w:val="20"/>
+        </w:rPr>
+        <w:t>- One-sentence answer: Does every defect need one AI bias or hallucination instance?</w:t>
       </w:r>
     </w:p>
     <w:p>
@@ -607,7 +3216,7 @@
         <w:rPr>
           <w:rFonts w:ascii="Arial" w:hAnsi="Arial"/>
         </w:rPr>
-        <w:t>5. How I reviewed, revised, or verified the AI output:</w:t>
+        <w:t>4. Specific parts of the work AI contributed to:</w:t>
       </w:r>
     </w:p>
     <w:p>
@@ -618,40 +3227,20 @@
           <w:color w:val="707070"/>
           <w:sz w:val="20"/>
         </w:rPr>
-        <w:t>Describe your verification method (ran the test, checked the spec, asked the TA, looked up RFC, cross-checked with the ISTQB syllabus, etc.).</w:t>
-      </w:r>
-    </w:p>
-    <w:p>
-      <w:r>
-        <w:rPr>
-          <w:rFonts w:ascii="Arial" w:hAnsi="Arial"/>
-        </w:rPr>
-        <w:t>__________________________________________________________________________________________</w:t>
-      </w:r>
-    </w:p>
-    <w:p>
-      <w:r>
-        <w:rPr>
-          <w:rFonts w:ascii="Arial" w:hAnsi="Arial"/>
-        </w:rPr>
-        <w:t>__________________________________________________________________________________________</w:t>
-      </w:r>
-    </w:p>
-    <w:p>
-      <w:r>
-        <w:rPr>
-          <w:rFonts w:ascii="Arial" w:hAnsi="Arial"/>
-        </w:rPr>
-        <w:t>__________________________________________________________________________________________</w:t>
-      </w:r>
-    </w:p>
-    <w:p>
-      <w:r>
-        <w:rPr>
-          <w:rFonts w:ascii="Arial" w:hAnsi="Arial"/>
-        </w:rPr>
-        <w:lastRenderedPageBreak/>
-        <w:t>__________________________________________________________________________________________</w:t>
+        <w:t>Be specific. Example: 'AI generated TC01–TC15 in Section 3.2; I rewrote TC04 and TC11; AI did NOT contribute to Sections 1, 2, 4, or the AI Critique.'</w:t>
+      </w:r>
+    </w:p>
+    <w:p>
+      <w:pPr>
+        <w:rPr>
+          <w:rFonts w:ascii="Arial" w:hAnsi="Arial" w:cs="Arial"/>
+        </w:rPr>
+      </w:pPr>
+      <w:r>
+        <w:rPr>
+          <w:rFonts w:ascii="Arial" w:hAnsi="Arial" w:cs="Arial"/>
+        </w:rPr>
+        <w:t>AI contributed to drafting and revising several HW01 artifacts: Requirement 1 AI impact analysis for 10 QA/QC job postings; Requirement 2 defect report structure, Vietnamese cleanup, and AI hallucination/bias/limitation review support; Requirement 3 baseline kettle test cases, student-fix revision for weak test cases, AI-missed edge case section, and Excel test artifact structure; and the G9.1 QA/QC role mindmap draft. I reviewed and modified the outputs, added stronger Requirement 3 edge cases, completed missing AI issue sections, corrected wording/formatting, and kept real product evidence, actual test execution results, confirmed defects, videos, and final submission decisions under my own responsibility.</w:t>
       </w:r>
     </w:p>
     <w:p>
@@ -662,7 +3251,7 @@
         <w:rPr>
           <w:rFonts w:ascii="Arial" w:hAnsi="Arial"/>
         </w:rPr>
-        <w:t>6. Citation (if required by course style guide):</w:t>
+        <w:t>5. How I reviewed, revised, or verified the AI output:</w:t>
       </w:r>
     </w:p>
     <w:p>
@@ -673,39 +3262,73 @@
           <w:color w:val="707070"/>
           <w:sz w:val="20"/>
         </w:rPr>
+        <w:t>Describe your verification method (ran the test, checked the spec, asked the TA, looked up RFC, cross-checked with the ISTQB syllabus, etc.).</w:t>
+      </w:r>
+    </w:p>
+    <w:p>
+      <w:pPr>
+        <w:rPr>
+          <w:rFonts w:ascii="Arial" w:hAnsi="Arial" w:cs="Arial"/>
+        </w:rPr>
+      </w:pPr>
+      <w:r>
+        <w:rPr>
+          <w:rFonts w:ascii="Arial" w:hAnsi="Arial" w:cs="Arial"/>
+        </w:rPr>
+        <w:t xml:space="preserve">I reviewed AI outputs against HW01 requirements, Appendix A prompt log, final report files, and ISTQB-style review criteria such as accuracy, completeness, ambiguity, traceability, and evidence. For Requirement 2, I compared AI explanations with the final defect report and rewrote weak findings as evidence-based hallucination, bias, or limitation notes. For Requirement 3, I checked that no actual test results, defects, </w:t>
+      </w:r>
+      <w:r>
+        <w:rPr>
+          <w:rFonts w:ascii="Arial" w:hAnsi="Arial" w:cs="Arial"/>
+        </w:rPr>
+        <w:lastRenderedPageBreak/>
+        <w:t>videos, screenshots, GitHub Issues, or product evidence were fabricated, and I replaced weak baseline test cases with stronger risk-based edge cases. I also corrected Vietnamese wording, formatting, and section names before submission.</w:t>
+      </w:r>
+    </w:p>
+    <w:p>
+      <w:pPr>
+        <w:pStyle w:val="Heading3"/>
+      </w:pPr>
+      <w:r>
+        <w:rPr>
+          <w:rFonts w:ascii="Arial" w:hAnsi="Arial"/>
+        </w:rPr>
+        <w:t>6. Citation (if required by course style guide):</w:t>
+      </w:r>
+    </w:p>
+    <w:p>
+      <w:r>
+        <w:rPr>
+          <w:rFonts w:ascii="Arial" w:hAnsi="Arial"/>
+          <w:i/>
+          <w:color w:val="707070"/>
+          <w:sz w:val="20"/>
+        </w:rPr>
         <w:t>Software Testing uses the IEEE style. Example: Anthropic. (2026). AI Tool (e.g., ChatGPT, Claude, Gemini) [Large language model]. https://claude.ai</w:t>
       </w:r>
     </w:p>
     <w:p>
       <w:r>
-        <w:rPr>
-          <w:rFonts w:ascii="Arial" w:hAnsi="Arial"/>
-        </w:rPr>
-        <w:t>__________________________________________________________________________________________</w:t>
-      </w:r>
-    </w:p>
-    <w:p>
-      <w:r>
-        <w:rPr>
-          <w:rFonts w:ascii="Arial" w:hAnsi="Arial"/>
-        </w:rPr>
-        <w:t>__________________________________________________________________________________________</w:t>
-      </w:r>
-    </w:p>
-    <w:p>
-      <w:r>
-        <w:rPr>
-          <w:rFonts w:ascii="Arial" w:hAnsi="Arial"/>
-        </w:rPr>
-        <w:t>__________________________________________________________________________________________</w:t>
-      </w:r>
-    </w:p>
-    <w:p>
-      <w:r>
-        <w:rPr>
-          <w:rFonts w:ascii="Arial" w:hAnsi="Arial"/>
-        </w:rPr>
-        <w:t>__________________________________________________________________________________________</w:t>
+        <w:t>-</w:t>
+      </w:r>
+      <w:r>
+        <w:t>OpenAI. (2026). GPT-5.5 [Large language model]. https://openai.com</w:t>
+      </w:r>
+    </w:p>
+    <w:p>
+      <w:r>
+        <w:t>-</w:t>
+      </w:r>
+      <w:r>
+        <w:t>Perplexity AI. (2026). Perplexity AI Assistant [AI-powered answer engine]. https://www.perplexity.ai</w:t>
+      </w:r>
+    </w:p>
+    <w:p>
+      <w:r>
+        <w:t>-</w:t>
+      </w:r>
+      <w:r>
+        <w:t>Cursor. (2026). Cursor IDE [AI-assisted software development environment]. https://www.cursor.com</w:t>
       </w:r>
     </w:p>
     <w:p>
@@ -742,7 +3365,7 @@
     <w:tbl>
       <w:tblPr>
         <w:tblStyle w:val="LightGrid-Accent1"/>
-        <w:tblW w:w="0" w:type="auto"/>
+        <w:tblW w:w="9638" w:type="dxa"/>
         <w:tblLayout w:type="fixed"/>
         <w:tblLook w:val="04A0" w:firstRow="1" w:lastRow="0" w:firstColumn="1" w:lastColumn="0" w:noHBand="0" w:noVBand="1"/>
       </w:tblPr>
@@ -778,6 +3401,9 @@
             <w:pPr>
               <w:cnfStyle w:val="100000000000" w:firstRow="1" w:lastRow="0" w:firstColumn="0" w:lastColumn="0" w:oddVBand="0" w:evenVBand="0" w:oddHBand="0" w:evenHBand="0" w:firstRowFirstColumn="0" w:firstRowLastColumn="0" w:lastRowFirstColumn="0" w:lastRowLastColumn="0"/>
             </w:pPr>
+            <w:r>
+              <w:t>ÂN TIẾN NGUYÊN AN</w:t>
+            </w:r>
           </w:p>
         </w:tc>
       </w:tr>
@@ -809,6 +3435,9 @@
             <w:pPr>
               <w:cnfStyle w:val="000000100000" w:firstRow="0" w:lastRow="0" w:firstColumn="0" w:lastColumn="0" w:oddVBand="0" w:evenVBand="0" w:oddHBand="1" w:evenHBand="0" w:firstRowFirstColumn="0" w:firstRowLastColumn="0" w:lastRowFirstColumn="0" w:lastRowLastColumn="0"/>
             </w:pPr>
+            <w:r>
+              <w:t>23127148</w:t>
+            </w:r>
           </w:p>
         </w:tc>
       </w:tr>
@@ -840,6 +3469,9 @@
             <w:pPr>
               <w:cnfStyle w:val="000000010000" w:firstRow="0" w:lastRow="0" w:firstColumn="0" w:lastColumn="0" w:oddVBand="0" w:evenVBand="0" w:oddHBand="0" w:evenHBand="1" w:firstRowFirstColumn="0" w:firstRowLastColumn="0" w:lastRowFirstColumn="0" w:lastRowLastColumn="0"/>
             </w:pPr>
+            <w:r>
+              <w:t>23KTPM2</w:t>
+            </w:r>
           </w:p>
         </w:tc>
       </w:tr>
@@ -923,6 +3555,25 @@
             <w:pPr>
               <w:cnfStyle w:val="000000010000" w:firstRow="0" w:lastRow="0" w:firstColumn="0" w:lastColumn="0" w:oddVBand="0" w:evenVBand="0" w:oddHBand="0" w:evenHBand="1" w:firstRowFirstColumn="0" w:firstRowLastColumn="0" w:lastRowFirstColumn="0" w:lastRowLastColumn="0"/>
             </w:pPr>
+            <w:r>
+              <w:t>Trần Thị Bích Hạnh</w:t>
+            </w:r>
+          </w:p>
+          <w:p>
+            <w:pPr>
+              <w:cnfStyle w:val="000000010000" w:firstRow="0" w:lastRow="0" w:firstColumn="0" w:lastColumn="0" w:oddVBand="0" w:evenVBand="0" w:oddHBand="0" w:evenHBand="1" w:firstRowFirstColumn="0" w:firstRowLastColumn="0" w:lastRowFirstColumn="0" w:lastRowLastColumn="0"/>
+            </w:pPr>
+            <w:r>
+              <w:t>Trương Phước Lộc</w:t>
+            </w:r>
+          </w:p>
+          <w:p>
+            <w:pPr>
+              <w:cnfStyle w:val="000000010000" w:firstRow="0" w:lastRow="0" w:firstColumn="0" w:lastColumn="0" w:oddVBand="0" w:evenVBand="0" w:oddHBand="0" w:evenHBand="1" w:firstRowFirstColumn="0" w:firstRowLastColumn="0" w:lastRowFirstColumn="0" w:lastRowLastColumn="0"/>
+            </w:pPr>
+            <w:r>
+              <w:t>Hồ Tuấn Thanh</w:t>
+            </w:r>
           </w:p>
         </w:tc>
       </w:tr>
@@ -954,6 +3605,9 @@
             <w:pPr>
               <w:cnfStyle w:val="000000100000" w:firstRow="0" w:lastRow="0" w:firstColumn="0" w:lastColumn="0" w:oddVBand="0" w:evenVBand="0" w:oddHBand="1" w:evenHBand="0" w:firstRowFirstColumn="0" w:firstRowLastColumn="0" w:lastRowFirstColumn="0" w:lastRowLastColumn="0"/>
             </w:pPr>
+            <w:r>
+              <w:t>08/06/2026</w:t>
+            </w:r>
           </w:p>
         </w:tc>
       </w:tr>
@@ -985,6 +3639,56 @@
             <w:pPr>
               <w:cnfStyle w:val="000000010000" w:firstRow="0" w:lastRow="0" w:firstColumn="0" w:lastColumn="0" w:oddVBand="0" w:evenVBand="0" w:oddHBand="0" w:evenHBand="1" w:firstRowFirstColumn="0" w:firstRowLastColumn="0" w:lastRowFirstColumn="0" w:lastRowLastColumn="0"/>
             </w:pPr>
+            <w:r>
+              <w:rPr>
+                <w:noProof/>
+              </w:rPr>
+              <w:drawing>
+                <wp:inline distT="0" distB="0" distL="0" distR="0" wp14:anchorId="1A83F223" wp14:editId="52ECDC7D">
+                  <wp:extent cx="1790700" cy="819785"/>
+                  <wp:effectExtent l="0" t="0" r="0" b="0"/>
+                  <wp:docPr id="1" name="Picture 1"/>
+                  <wp:cNvGraphicFramePr>
+                    <a:graphicFrameLocks xmlns:a="http://schemas.openxmlformats.org/drawingml/2006/main" noChangeAspect="1"/>
+                  </wp:cNvGraphicFramePr>
+                  <a:graphic xmlns:a="http://schemas.openxmlformats.org/drawingml/2006/main">
+                    <a:graphicData uri="http://schemas.openxmlformats.org/drawingml/2006/picture">
+                      <pic:pic xmlns:pic="http://schemas.openxmlformats.org/drawingml/2006/picture">
+                        <pic:nvPicPr>
+                          <pic:cNvPr id="1" name="Picture 1"/>
+                          <pic:cNvPicPr>
+                            <a:picLocks noChangeAspect="1"/>
+                          </pic:cNvPicPr>
+                        </pic:nvPicPr>
+                        <pic:blipFill>
+                          <a:blip r:embed="rId6"/>
+                          <a:stretch>
+                            <a:fillRect/>
+                          </a:stretch>
+                        </pic:blipFill>
+                        <pic:spPr>
+                          <a:xfrm>
+                            <a:off x="0" y="0"/>
+                            <a:ext cx="1790700" cy="819785"/>
+                          </a:xfrm>
+                          <a:prstGeom prst="rect">
+                            <a:avLst/>
+                          </a:prstGeom>
+                        </pic:spPr>
+                      </pic:pic>
+                    </a:graphicData>
+                  </a:graphic>
+                </wp:inline>
+              </w:drawing>
+            </w:r>
+          </w:p>
+          <w:p>
+            <w:pPr>
+              <w:cnfStyle w:val="000000010000" w:firstRow="0" w:lastRow="0" w:firstColumn="0" w:lastColumn="0" w:oddVBand="0" w:evenVBand="0" w:oddHBand="0" w:evenHBand="1" w:firstRowFirstColumn="0" w:firstRowLastColumn="0" w:lastRowFirstColumn="0" w:lastRowLastColumn="0"/>
+            </w:pPr>
+            <w:r>
+              <w:t>ÂN TIẾN NGUYÊN AN</w:t>
+            </w:r>
           </w:p>
         </w:tc>
       </w:tr>

</xml_diff>